<commit_message>
Il filmato del ponte e' nel gioco: la_luce_se_ne_va
Arrivato dall'altra IA e montato. Era tecnicamente giusto (H.264 + AAC,
1280x720, 30 fps, 10 secondi) ma pesava 19,4 MB contro i 3 di limite, e
l'audio stava 9 dB sopra gli altri quattro filmati.

Ricompresso in due passate a 2,2 Mbps con pix_fmt yuv420p e faststart:
2,83 MB, dieci secondi esatti. Audio riportato a -22,2 dB di media
(gli altri stanno a -23) con una dissolvenza in chiusura di otto decimi.
L'originale resta in assets/video/orig/, fuori dal repo.

Provata la catena intera nel browser: settore 20 -> vittoria -> CONTINUA
-> il filmato parte non muto e va fino in fondo -> settore 21 dentro la
Frattura con l'insegna "OLTRE LA FRATTURA".

Nella Bibbia il filmato passa fra quelli fatti: adesso sono cinque, e
i "da fare" sono nove.

Co-Authored-By: Claude Opus 5 <noreply@anthropic.com>
</commit_message>
<xml_diff>
--- a/VOLT_Bibbia.docx
+++ b/VOLT_Bibbia.docx
@@ -9455,7 +9455,7 @@
         <w:t>Fatti</w:t>
       </w:r>
       <w:r>
-        <w:t xml:space="preserve"> (già dentro il gioco, quattro):</w:t>
+        <w:t xml:space="preserve"> (già dentro il gioco, cinque):</w:t>
       </w:r>
     </w:p>
     <w:tbl>
@@ -9802,6 +9802,73 @@
                 <w:sz w:val="20"/>
               </w:rPr>
               <w:t>Lyra apre la cella col guanto, si abbracciano</w:t>
+            </w:r>
+          </w:p>
+        </w:tc>
+      </w:tr>
+      <w:tr>
+        <w:tc>
+          <w:tcPr>
+            <w:tcW w:type="dxa" w:w="3173"/>
+          </w:tcPr>
+          <w:p>
+            <w:pPr>
+              <w:spacing w:after="40"/>
+            </w:pPr>
+            <w:r>
+              <w:rPr>
+                <w:sz w:val="20"/>
+              </w:rPr>
+            </w:r>
+            <w:r>
+              <w:rPr>
+                <w:rFonts w:ascii="Consolas" w:hAnsi="Consolas"/>
+                <w:color w:val="7A3FD6"/>
+                <w:sz w:val="20"/>
+              </w:rPr>
+              <w:t>la_luce_se_ne_va</w:t>
+            </w:r>
+          </w:p>
+        </w:tc>
+        <w:tc>
+          <w:tcPr>
+            <w:tcW w:type="dxa" w:w="3173"/>
+          </w:tcPr>
+          <w:p>
+            <w:pPr>
+              <w:spacing w:after="40"/>
+            </w:pPr>
+            <w:r>
+              <w:rPr>
+                <w:sz w:val="20"/>
+              </w:rPr>
+            </w:r>
+            <w:r>
+              <w:rPr>
+                <w:sz w:val="20"/>
+              </w:rPr>
+              <w:t>premendo CONTINUA, dopo il 20</w:t>
+            </w:r>
+          </w:p>
+        </w:tc>
+        <w:tc>
+          <w:tcPr>
+            <w:tcW w:type="dxa" w:w="3173"/>
+          </w:tcPr>
+          <w:p>
+            <w:pPr>
+              <w:spacing w:after="40"/>
+            </w:pPr>
+            <w:r>
+              <w:rPr>
+                <w:sz w:val="20"/>
+              </w:rPr>
+            </w:r>
+            <w:r>
+              <w:rPr>
+                <w:sz w:val="20"/>
+              </w:rPr>
+              <w:t>I due davanti alla Frattura: isole di Lumina sospese nel viola, saette, e la luce di casa che se ne va</w:t>
             </w:r>
           </w:p>
         </w:tc>
@@ -9985,7 +10052,7 @@
                 <w:color w:val="7A3FD6"/>
                 <w:sz w:val="20"/>
               </w:rPr>
-              <w:t>la_luce_se_ne_va</w:t>
+              <w:t>il_tradimento</w:t>
             </w:r>
           </w:p>
         </w:tc>
@@ -10006,7 +10073,7 @@
               <w:rPr>
                 <w:sz w:val="20"/>
               </w:rPr>
-              <w:t>subito dopo la liberazione, prima del 21</w:t>
+              <w:t>settore 35</w:t>
             </w:r>
           </w:p>
         </w:tc>
@@ -10027,7 +10094,7 @@
               <w:rPr>
                 <w:sz w:val="20"/>
               </w:rPr>
-              <w:t>I due si abbracciano; dietro di loro Lumina si spegne a fasce. Una sagoma attraversa la Frattura con una luce verde in mano</w:t>
+              <w:t>ECHO-0 sta per cadere; dal buio arriva ECHO-1, gli strappa Ampere e sparisce. ECHO-0 resta in ginocchio</w:t>
             </w:r>
           </w:p>
         </w:tc>
@@ -10097,7 +10164,7 @@
                 <w:color w:val="7A3FD6"/>
                 <w:sz w:val="20"/>
               </w:rPr>
-              <w:t>il_tradimento</w:t>
+              <w:t>il_passaggio</w:t>
             </w:r>
           </w:p>
         </w:tc>
@@ -10119,7 +10186,7 @@
               <w:rPr>
                 <w:sz w:val="20"/>
               </w:rPr>
-              <w:t>settore 35</w:t>
+              <w:t>subito dopo</w:t>
             </w:r>
           </w:p>
         </w:tc>
@@ -10141,7 +10208,7 @@
               <w:rPr>
                 <w:sz w:val="20"/>
               </w:rPr>
-              <w:t>ECHO-0 sta per cadere; dal buio arriva ECHO-1, gli strappa Ampere e sparisce. ECHO-0 resta in ginocchio</w:t>
+              <w:t>ECHO-0 si rialza e apre una fenditura nel fondo del viola: si intravede Eclissia</w:t>
             </w:r>
           </w:p>
         </w:tc>
@@ -10210,7 +10277,7 @@
                 <w:color w:val="7A3FD6"/>
                 <w:sz w:val="20"/>
               </w:rPr>
-              <w:t>il_passaggio</w:t>
+              <w:t>il_finale</w:t>
             </w:r>
           </w:p>
         </w:tc>
@@ -10231,7 +10298,7 @@
               <w:rPr>
                 <w:sz w:val="20"/>
               </w:rPr>
-              <w:t>subito dopo</w:t>
+              <w:t>settore 65</w:t>
             </w:r>
           </w:p>
         </w:tc>
@@ -10252,7 +10319,7 @@
               <w:rPr>
                 <w:sz w:val="20"/>
               </w:rPr>
-              <w:t>ECHO-0 si rialza e apre una fenditura nel fondo del viola: si intravede Eclissia</w:t>
+              <w:t>L'eruzione verde che si divide in filamenti e cuce il cielo; un filo di corrente devia nel nucleo di ECHO-0; la creatura che resta; il ritorno a Lumina</w:t>
             </w:r>
           </w:p>
         </w:tc>
@@ -10322,7 +10389,7 @@
                 <w:color w:val="7A3FD6"/>
                 <w:sz w:val="20"/>
               </w:rPr>
-              <w:t>il_finale</w:t>
+              <w:t>dentro_la_frattura</w:t>
             </w:r>
           </w:p>
         </w:tc>
@@ -10344,7 +10411,7 @@
               <w:rPr>
                 <w:sz w:val="20"/>
               </w:rPr>
-              <w:t>settore 65</w:t>
+              <w:t>settore 21</w:t>
             </w:r>
           </w:p>
         </w:tc>
@@ -10366,7 +10433,7 @@
               <w:rPr>
                 <w:sz w:val="20"/>
               </w:rPr>
-              <w:t>L'eruzione verde che si divide in filamenti e cuce il cielo; un filo di corrente devia nel nucleo di ECHO-0; la creatura che resta; il ritorno a Lumina</w:t>
+              <w:t>I due entrano insieme; il mondo è fatto di pezzi di casa loro</w:t>
             </w:r>
           </w:p>
         </w:tc>
@@ -10386,10 +10453,9 @@
             </w:r>
             <w:r>
               <w:rPr>
-                <w:b/>
-                <w:sz w:val="20"/>
-              </w:rPr>
-              <w:t>essenziale</w:t>
+                <w:sz w:val="20"/>
+              </w:rPr>
+              <w:t>desiderabile</w:t>
             </w:r>
           </w:p>
         </w:tc>
@@ -10435,7 +10501,7 @@
                 <w:color w:val="7A3FD6"/>
                 <w:sz w:val="20"/>
               </w:rPr>
-              <w:t>dentro_la_frattura</w:t>
+              <w:t>primo_incontro</w:t>
             </w:r>
           </w:p>
         </w:tc>
@@ -10456,7 +10522,7 @@
               <w:rPr>
                 <w:sz w:val="20"/>
               </w:rPr>
-              <w:t>settore 21</w:t>
+              <w:t>settore 24</w:t>
             </w:r>
           </w:p>
         </w:tc>
@@ -10477,7 +10543,7 @@
               <w:rPr>
                 <w:sz w:val="20"/>
               </w:rPr>
-              <w:t>I due entrano insieme; il mondo è fatto di pezzi di casa loro</w:t>
+              <w:t>ECHO-0 appare e parla per la prima volta</w:t>
             </w:r>
           </w:p>
         </w:tc>
@@ -10546,7 +10612,7 @@
                 <w:color w:val="7A3FD6"/>
                 <w:sz w:val="20"/>
               </w:rPr>
-              <w:t>primo_incontro</w:t>
+              <w:t>ampere_torna</w:t>
             </w:r>
           </w:p>
         </w:tc>
@@ -10568,7 +10634,7 @@
               <w:rPr>
                 <w:sz w:val="20"/>
               </w:rPr>
-              <w:t>settore 24</w:t>
+              <w:t>settore 30</w:t>
             </w:r>
           </w:p>
         </w:tc>
@@ -10590,7 +10656,7 @@
               <w:rPr>
                 <w:sz w:val="20"/>
               </w:rPr>
-              <w:t>ECHO-0 appare e parla per la prima volta</w:t>
+              <w:t>Gliela strappano di mano; la lanterna si accende fra i due</w:t>
             </w:r>
           </w:p>
         </w:tc>
@@ -10658,7 +10724,7 @@
                 <w:color w:val="7A3FD6"/>
                 <w:sz w:val="20"/>
               </w:rPr>
-              <w:t>ampere_torna</w:t>
+              <w:t>eclissia</w:t>
             </w:r>
           </w:p>
         </w:tc>
@@ -10679,7 +10745,7 @@
               <w:rPr>
                 <w:sz w:val="20"/>
               </w:rPr>
-              <w:t>settore 30</w:t>
+              <w:t>settore 36</w:t>
             </w:r>
           </w:p>
         </w:tc>
@@ -10700,7 +10766,7 @@
               <w:rPr>
                 <w:sz w:val="20"/>
               </w:rPr>
-              <w:t>Gliela strappano di mano; la lanterna si accende fra i due</w:t>
+              <w:t>La prima immagine del mondo nuovo, con il vulcano all'orizzonte</w:t>
             </w:r>
           </w:p>
         </w:tc>
@@ -10769,7 +10835,7 @@
                 <w:color w:val="7A3FD6"/>
                 <w:sz w:val="20"/>
               </w:rPr>
-              <w:t>eclissia</w:t>
+              <w:t>il_reattore</w:t>
             </w:r>
           </w:p>
         </w:tc>
@@ -10791,7 +10857,7 @@
               <w:rPr>
                 <w:sz w:val="20"/>
               </w:rPr>
-              <w:t>settore 36</w:t>
+              <w:t>settore 56</w:t>
             </w:r>
           </w:p>
         </w:tc>
@@ -10813,7 +10879,7 @@
               <w:rPr>
                 <w:sz w:val="20"/>
               </w:rPr>
-              <w:t>La prima immagine del mondo nuovo, con il vulcano all'orizzonte</w:t>
+              <w:t>ECHO-1 cade, le tre morse si aprono, Ampere esce e si riempie di colpo</w:t>
             </w:r>
           </w:p>
         </w:tc>
@@ -10881,7 +10947,7 @@
                 <w:color w:val="7A3FD6"/>
                 <w:sz w:val="20"/>
               </w:rPr>
-              <w:t>il_reattore</w:t>
+              <w:t>la_cima</w:t>
             </w:r>
           </w:p>
         </w:tc>
@@ -10902,7 +10968,7 @@
               <w:rPr>
                 <w:sz w:val="20"/>
               </w:rPr>
-              <w:t>settore 56</w:t>
+              <w:t>settore 65, prima dello scontro</w:t>
             </w:r>
           </w:p>
         </w:tc>
@@ -10923,127 +10989,13 @@
               <w:rPr>
                 <w:sz w:val="20"/>
               </w:rPr>
-              <w:t>ECHO-1 cade, le tre morse si aprono, Ampere esce e si riempie di colpo</w:t>
+              <w:t>OHM appare sopra il cratere; il segno Ω si accende</w:t>
             </w:r>
           </w:p>
         </w:tc>
         <w:tc>
           <w:tcPr>
             <w:tcW w:type="dxa" w:w="1904"/>
-          </w:tcPr>
-          <w:p>
-            <w:pPr>
-              <w:spacing w:after="40"/>
-            </w:pPr>
-            <w:r>
-              <w:rPr>
-                <w:sz w:val="20"/>
-              </w:rPr>
-            </w:r>
-            <w:r>
-              <w:rPr>
-                <w:sz w:val="20"/>
-              </w:rPr>
-              <w:t>desiderabile</w:t>
-            </w:r>
-          </w:p>
-        </w:tc>
-      </w:tr>
-      <w:tr>
-        <w:tc>
-          <w:tcPr>
-            <w:tcW w:type="dxa" w:w="1904"/>
-            <w:shd w:val="clear" w:fill="F1EFF8"/>
-          </w:tcPr>
-          <w:p>
-            <w:pPr>
-              <w:spacing w:after="40"/>
-            </w:pPr>
-            <w:r>
-              <w:rPr>
-                <w:sz w:val="20"/>
-              </w:rPr>
-            </w:r>
-            <w:r>
-              <w:rPr>
-                <w:sz w:val="20"/>
-              </w:rPr>
-              <w:t>10</w:t>
-            </w:r>
-          </w:p>
-        </w:tc>
-        <w:tc>
-          <w:tcPr>
-            <w:tcW w:type="dxa" w:w="1904"/>
-            <w:shd w:val="clear" w:fill="F1EFF8"/>
-          </w:tcPr>
-          <w:p>
-            <w:pPr>
-              <w:spacing w:after="40"/>
-            </w:pPr>
-            <w:r>
-              <w:rPr>
-                <w:sz w:val="20"/>
-              </w:rPr>
-            </w:r>
-            <w:r>
-              <w:rPr>
-                <w:rFonts w:ascii="Consolas" w:hAnsi="Consolas"/>
-                <w:color w:val="7A3FD6"/>
-                <w:sz w:val="20"/>
-              </w:rPr>
-              <w:t>la_cima</w:t>
-            </w:r>
-          </w:p>
-        </w:tc>
-        <w:tc>
-          <w:tcPr>
-            <w:tcW w:type="dxa" w:w="1904"/>
-            <w:shd w:val="clear" w:fill="F1EFF8"/>
-          </w:tcPr>
-          <w:p>
-            <w:pPr>
-              <w:spacing w:after="40"/>
-            </w:pPr>
-            <w:r>
-              <w:rPr>
-                <w:sz w:val="20"/>
-              </w:rPr>
-            </w:r>
-            <w:r>
-              <w:rPr>
-                <w:sz w:val="20"/>
-              </w:rPr>
-              <w:t>settore 65, prima dello scontro</w:t>
-            </w:r>
-          </w:p>
-        </w:tc>
-        <w:tc>
-          <w:tcPr>
-            <w:tcW w:type="dxa" w:w="1904"/>
-            <w:shd w:val="clear" w:fill="F1EFF8"/>
-          </w:tcPr>
-          <w:p>
-            <w:pPr>
-              <w:spacing w:after="40"/>
-            </w:pPr>
-            <w:r>
-              <w:rPr>
-                <w:sz w:val="20"/>
-              </w:rPr>
-            </w:r>
-            <w:r>
-              <w:rPr>
-                <w:sz w:val="20"/>
-              </w:rPr>
-              <w:t>OHM appare sopra il cratere; il segno Ω si accende</w:t>
-            </w:r>
-          </w:p>
-        </w:tc>
-        <w:tc>
-          <w:tcPr>
-            <w:tcW w:type="dxa" w:w="1904"/>
-            <w:shd w:val="clear" w:fill="F1EFF8"/>
           </w:tcPr>
           <w:p>
             <w:pPr>

</xml_diff>

<commit_message>
v35: i due rapimenti nuovi, e i filmati adesso hanno il numero di versione
Arrivati i due rapimenti rifatti. Erano 15 MB l'uno con l'audio dieci
decibel sopra gli altri: ricompressi in due passate a 2,8 Mbps
(2,1 MB l'uno, sei secondi, qualita' piu' alta del filmato del ponte
perche' sono piu' corti) e audio riportato a -23 dB con dissolvenza in
chiusura. I due vecchi restano in assets/video/orig/.

Sono perfettamente speculari e non mostrano la lanterna: deciso dal Capo,
sono i primi dieci secondi del gioco e non devono spiegare niente.
Ampere entra in scena al settore 15.

E un difetto trovato provandoli: i filmati venivano caricati senza il
numero di versione, quindi un telefono con in cache quello vecchio
continuava a mostrarlo. Adesso anche i video portano ?v= come il resto.

Co-Authored-By: Claude Opus 5 <noreply@anthropic.com>
</commit_message>
<xml_diff>
--- a/VOLT_Bibbia.docx
+++ b/VOLT_Bibbia.docx
@@ -9657,7 +9657,7 @@
               <w:rPr>
                 <w:sz w:val="20"/>
               </w:rPr>
-              <w:t>Lyra viene separata, trascinata oltre il portale, rinchiusa</w:t>
+              <w:t>Lyra viene strappata via dai viticci viola; le due mani si cercano e non si toccano; resta Aren solo, con la mano ancora tesa</w:t>
             </w:r>
           </w:p>
         </w:tc>
@@ -9727,7 +9727,7 @@
               <w:rPr>
                 <w:sz w:val="20"/>
               </w:rPr>
-              <w:t>Aren protegge il Nucleo, viene sopraffatto, imprigionato</w:t>
+              <w:t>La stessa scena rovesciata: è Aren a essere preso</w:t>
             </w:r>
           </w:p>
         </w:tc>

</xml_diff>

<commit_message>
L'introduzione entra nella Bibbia
Sei filmati fatti invece di cinque, e la regola su dove si semina
Ampere: mai nei rapimenti, in penombra nell'introduzione, e nessuno
la indica mai.

Co-Authored-By: Claude Opus 5 <noreply@anthropic.com>
</commit_message>
<xml_diff>
--- a/VOLT_Bibbia.docx
+++ b/VOLT_Bibbia.docx
@@ -9518,7 +9518,7 @@
         <w:t>Fatti</w:t>
       </w:r>
       <w:r>
-        <w:t xml:space="preserve"> (già dentro il gioco, cinque):</w:t>
+        <w:t xml:space="preserve"> (già dentro il gioco, sei):</w:t>
       </w:r>
     </w:p>
     <w:tbl>
@@ -9615,7 +9615,7 @@
                 <w:color w:val="7A3FD6"/>
                 <w:sz w:val="20"/>
               </w:rPr>
-              <w:t>rapimento_lyra</w:t>
+              <w:t>introduzione</w:t>
             </w:r>
           </w:p>
         </w:tc>
@@ -9636,7 +9636,7 @@
               <w:rPr>
                 <w:sz w:val="20"/>
               </w:rPr>
-              <w:t>inizio, se giochi Aren</w:t>
+              <w:t>all'apertura del gioco, prima della scelta</w:t>
             </w:r>
           </w:p>
         </w:tc>
@@ -9657,7 +9657,7 @@
               <w:rPr>
                 <w:sz w:val="20"/>
               </w:rPr>
-              <w:t>Lyra viene strappata via dai viticci viola; le due mani si cercano e non si toccano; resta Aren solo, con la mano ancora tesa</w:t>
+              <w:t>Lumina dall'alto, la centrale, i due di turno, e il cielo che si spacca. La lanterna si intravede in penombra dietro un oblò, e nessuno la indica</w:t>
             </w:r>
           </w:p>
         </w:tc>
@@ -9683,7 +9683,7 @@
                 <w:color w:val="7A3FD6"/>
                 <w:sz w:val="20"/>
               </w:rPr>
-              <w:t>rapimento_aren</w:t>
+              <w:t>rapimento_lyra</w:t>
             </w:r>
           </w:p>
         </w:tc>
@@ -9705,7 +9705,7 @@
               <w:rPr>
                 <w:sz w:val="20"/>
               </w:rPr>
-              <w:t>inizio, se giochi Lyra</w:t>
+              <w:t>inizio, se giochi Aren</w:t>
             </w:r>
           </w:p>
         </w:tc>
@@ -9727,7 +9727,7 @@
               <w:rPr>
                 <w:sz w:val="20"/>
               </w:rPr>
-              <w:t>La stessa scena rovesciata: è Aren a essere preso</w:t>
+              <w:t>Lyra viene strappata via dai viticci viola; le due mani si cercano e non si toccano; resta Aren solo, con la mano ancora tesa</w:t>
             </w:r>
           </w:p>
         </w:tc>
@@ -9752,7 +9752,7 @@
                 <w:color w:val="7A3FD6"/>
                 <w:sz w:val="20"/>
               </w:rPr>
-              <w:t>liberazione_lyra</w:t>
+              <w:t>rapimento_aren</w:t>
             </w:r>
           </w:p>
         </w:tc>
@@ -9773,7 +9773,7 @@
               <w:rPr>
                 <w:sz w:val="20"/>
               </w:rPr>
-              <w:t>dopo il settore 20</w:t>
+              <w:t>inizio, se giochi Lyra</w:t>
             </w:r>
           </w:p>
         </w:tc>
@@ -9794,7 +9794,7 @@
               <w:rPr>
                 <w:sz w:val="20"/>
               </w:rPr>
-              <w:t>Aren spezza la cella, si abbracciano</w:t>
+              <w:t>La stessa scena rovesciata: è Aren a essere preso</w:t>
             </w:r>
           </w:p>
         </w:tc>
@@ -9820,7 +9820,7 @@
                 <w:color w:val="7A3FD6"/>
                 <w:sz w:val="20"/>
               </w:rPr>
-              <w:t>liberazione_aren</w:t>
+              <w:t>liberazione_lyra</w:t>
             </w:r>
           </w:p>
         </w:tc>
@@ -9864,7 +9864,7 @@
               <w:rPr>
                 <w:sz w:val="20"/>
               </w:rPr>
-              <w:t>Lyra apre la cella col guanto, si abbracciano</w:t>
+              <w:t>Aren spezza la cella, si abbracciano</w:t>
             </w:r>
           </w:p>
         </w:tc>
@@ -9889,7 +9889,7 @@
                 <w:color w:val="7A3FD6"/>
                 <w:sz w:val="20"/>
               </w:rPr>
-              <w:t>la_luce_se_ne_va</w:t>
+              <w:t>liberazione_aren</w:t>
             </w:r>
           </w:p>
         </w:tc>
@@ -9910,13 +9910,83 @@
               <w:rPr>
                 <w:sz w:val="20"/>
               </w:rPr>
-              <w:t>premendo CONTINUA, dopo il 20</w:t>
+              <w:t>dopo il settore 20</w:t>
             </w:r>
           </w:p>
         </w:tc>
         <w:tc>
           <w:tcPr>
             <w:tcW w:type="dxa" w:w="3173"/>
+          </w:tcPr>
+          <w:p>
+            <w:pPr>
+              <w:spacing w:after="40"/>
+            </w:pPr>
+            <w:r>
+              <w:rPr>
+                <w:sz w:val="20"/>
+              </w:rPr>
+            </w:r>
+            <w:r>
+              <w:rPr>
+                <w:sz w:val="20"/>
+              </w:rPr>
+              <w:t>Lyra apre la cella col guanto, si abbracciano</w:t>
+            </w:r>
+          </w:p>
+        </w:tc>
+      </w:tr>
+      <w:tr>
+        <w:tc>
+          <w:tcPr>
+            <w:tcW w:type="dxa" w:w="3173"/>
+            <w:shd w:val="clear" w:fill="F1EFF8"/>
+          </w:tcPr>
+          <w:p>
+            <w:pPr>
+              <w:spacing w:after="40"/>
+            </w:pPr>
+            <w:r>
+              <w:rPr>
+                <w:sz w:val="20"/>
+              </w:rPr>
+            </w:r>
+            <w:r>
+              <w:rPr>
+                <w:rFonts w:ascii="Consolas" w:hAnsi="Consolas"/>
+                <w:color w:val="7A3FD6"/>
+                <w:sz w:val="20"/>
+              </w:rPr>
+              <w:t>la_luce_se_ne_va</w:t>
+            </w:r>
+          </w:p>
+        </w:tc>
+        <w:tc>
+          <w:tcPr>
+            <w:tcW w:type="dxa" w:w="3173"/>
+            <w:shd w:val="clear" w:fill="F1EFF8"/>
+          </w:tcPr>
+          <w:p>
+            <w:pPr>
+              <w:spacing w:after="40"/>
+            </w:pPr>
+            <w:r>
+              <w:rPr>
+                <w:sz w:val="20"/>
+              </w:rPr>
+            </w:r>
+            <w:r>
+              <w:rPr>
+                <w:sz w:val="20"/>
+              </w:rPr>
+              <w:t>premendo CONTINUA, dopo il 20</w:t>
+            </w:r>
+          </w:p>
+        </w:tc>
+        <w:tc>
+          <w:tcPr>
+            <w:tcW w:type="dxa" w:w="3173"/>
+            <w:shd w:val="clear" w:fill="F1EFF8"/>
           </w:tcPr>
           <w:p>
             <w:pPr>
@@ -11080,6 +11150,35 @@
       </w:tr>
     </w:tbl>
     <w:p/>
+    <w:p>
+      <w:r>
+        <w:rPr>
+          <w:b/>
+        </w:rPr>
+        <w:t>Dove si semina Ampere.</w:t>
+      </w:r>
+      <w:r>
+        <w:t xml:space="preserve"> Nei due rapimenti la lanterna </w:t>
+      </w:r>
+      <w:r>
+        <w:rPr>
+          <w:b/>
+        </w:rPr>
+        <w:t>non si vede</w:t>
+      </w:r>
+      <w:r>
+        <w:t xml:space="preserve">: sono i primi secondi del gioco e non devono spiegare niente. </w:t>
+      </w:r>
+      <w:r>
+        <w:rPr>
+          <w:b/>
+        </w:rPr>
+        <w:t>Nell'introduzione invece c'è, ma in penombra</w:t>
+      </w:r>
+      <w:r>
+        <w:t>, dietro l'oblò della centrale, mentre l'attenzione è altrove. Chi la nota non capisce cos'è — e al settore 15, quando il Comandante della Laguna se la porta via, sente un click senza sapere perché. È il modo giusto di seminare: presente, mai indicata.</w:t>
+      </w:r>
+    </w:p>
     <w:p>
       <w:r>
         <w:rPr>

</xml_diff>

<commit_message>
v38: Aren e Lyra ridisegnati, piu' vicini ai render
Erano due capsule identiche con i colori scambiati. Adesso sono due
personaggi diversi anche da lontano.

AREN: casco bianco con la visiera scura a fascia (prima la visiera si
mangiava tutta la testa), cresta ciano, disco tondo sull'orecchio,
spalline, cintura ciano, fulmine giallo sul petto, stivali chiari con
l'anello alla caviglia.

LYRA: niente casco. Faccia scoperta con occhi e sorriso, capelli viola
corti con la ciocca gialla, tuta bianca e corallo, innesto ciano sul
petto. E' la differenza che si legge a colpo d'occhio in partita.

Per tutti e due: spalline, cintura, stivali con l'anello colorato e un
pettorale scuro che taglia il busto invece della pillola unica.

Scritto anche nella Bibbia, con i colori nuovi: se in una scena Lyra ha
il casco, quella scena e' sbagliata.

Co-Authored-By: Claude Opus 5 <noreply@anthropic.com>
</commit_message>
<xml_diff>
--- a/VOLT_Bibbia.docx
+++ b/VOLT_Bibbia.docx
@@ -1202,7 +1202,7 @@
         <w:t>#ff5d8f</w:t>
       </w:r>
       <w:r>
-        <w:t xml:space="preserve">, gambe </w:t>
+        <w:t xml:space="preserve">, tuta interna </w:t>
       </w:r>
       <w:r>
         <w:rPr>
@@ -1210,10 +1210,50 @@
           <w:color w:val="7A3FD6"/>
           <w:sz w:val="19"/>
         </w:rPr>
-        <w:t>#3a4a86</w:t>
+        <w:t>#232a52</w:t>
+      </w:r>
+      <w:r>
+        <w:t xml:space="preserve">, gambe </w:t>
+      </w:r>
+      <w:r>
+        <w:rPr>
+          <w:rFonts w:ascii="Consolas" w:hAnsi="Consolas"/>
+          <w:color w:val="7A3FD6"/>
+          <w:sz w:val="19"/>
+        </w:rPr>
+        <w:t>#2b3566</w:t>
       </w:r>
       <w:r>
         <w:t>.</w:t>
+      </w:r>
+    </w:p>
+    <w:p>
+      <w:r>
+        <w:rPr>
+          <w:b/>
+        </w:rPr>
+        <w:t>Nel gioco</w:t>
+      </w:r>
+      <w:r>
+        <w:t xml:space="preserve"> (disegnato in codice): casco bianco con la </w:t>
+      </w:r>
+      <w:r>
+        <w:rPr>
+          <w:b/>
+        </w:rPr>
+        <w:t>visiera scura a fascia</w:t>
+      </w:r>
+      <w:r>
+        <w:t xml:space="preserve">, cresta ciano e disco tondo sull'orecchio; spalline chiare, cintura ciano, </w:t>
+      </w:r>
+      <w:r>
+        <w:rPr>
+          <w:b/>
+        </w:rPr>
+        <w:t>fulmine giallo sul petto</w:t>
+      </w:r>
+      <w:r>
+        <w:t>, stivali chiari con l'anello ciano alla caviglia. La sciarpa fucsia lo segue.</w:t>
       </w:r>
     </w:p>
     <w:p>
@@ -1279,7 +1319,7 @@
           <w:color w:val="7A3FD6"/>
           <w:sz w:val="19"/>
         </w:rPr>
-        <w:t>#7a3fd6</w:t>
+        <w:t>#9457e8</w:t>
       </w:r>
       <w:r>
         <w:t xml:space="preserve">, ciocca </w:t>
@@ -1293,7 +1333,7 @@
         <w:t>#ffd166</w:t>
       </w:r>
       <w:r>
-        <w:t xml:space="preserve">, gambe </w:t>
+        <w:t xml:space="preserve">, tuta corallo </w:t>
       </w:r>
       <w:r>
         <w:rPr>
@@ -1301,10 +1341,61 @@
           <w:color w:val="7A3FD6"/>
           <w:sz w:val="19"/>
         </w:rPr>
-        <w:t>#4a2f7a</w:t>
+        <w:t>#c2405f</w:t>
+      </w:r>
+      <w:r>
+        <w:t xml:space="preserve">, incarnato </w:t>
+      </w:r>
+      <w:r>
+        <w:rPr>
+          <w:rFonts w:ascii="Consolas" w:hAnsi="Consolas"/>
+          <w:color w:val="7A3FD6"/>
+          <w:sz w:val="19"/>
+        </w:rPr>
+        <w:t>#e0a074</w:t>
+      </w:r>
+      <w:r>
+        <w:t xml:space="preserve">, gambe </w:t>
+      </w:r>
+      <w:r>
+        <w:rPr>
+          <w:rFonts w:ascii="Consolas" w:hAnsi="Consolas"/>
+          <w:color w:val="7A3FD6"/>
+          <w:sz w:val="19"/>
+        </w:rPr>
+        <w:t>#3a2a5e</w:t>
       </w:r>
       <w:r>
         <w:t>.</w:t>
+      </w:r>
+    </w:p>
+    <w:p>
+      <w:r>
+        <w:rPr>
+          <w:b/>
+        </w:rPr>
+        <w:t>Nel gioco</w:t>
+      </w:r>
+      <w:r>
+        <w:t xml:space="preserve"> (disegnato in codice): </w:t>
+      </w:r>
+      <w:r>
+        <w:rPr>
+          <w:b/>
+        </w:rPr>
+        <w:t>Lyra non porta il casco</w:t>
+      </w:r>
+      <w:r>
+        <w:t xml:space="preserve">, e questa è la differenza che si vede da lontano. Faccia scoperta con occhi e sorriso, capelli viola corti con la </w:t>
+      </w:r>
+      <w:r>
+        <w:rPr>
+          <w:b/>
+        </w:rPr>
+        <w:t>ciocca gialla</w:t>
+      </w:r>
+      <w:r>
+        <w:t>, tuta bianca e corallo, innesto ciano sul petto, spalline e stivali. Se in una scena Lyra ha il casco, è sbagliata.</w:t>
       </w:r>
     </w:p>
     <w:p>

</xml_diff>

<commit_message>
Il passaggio della scintilla: senza, non si capisce che Eclio e' ECHO-0
Il Capo ha trovato il buco. Su CHI non c'era errore — Eclio e' ECHO-0
salvato, e la Bibbia lo dice — ma nella commessa dei filmati mancava il
passaggio in mezzo: la scintilla che lascia il corpo di ECHO-0 ed entra
nel vetro di Ampere. Senza quel tragitto Eclio esce dalla lanterna dal
nulla e nessuno capisce che e' lui.

Aggiunto in DA-FARE.md (una battuta in piu' nel finale, con scritto che
e' la piu' importante) e nella Bibbia, con un vincolo: quel tragitto va
mostrato in qualunque media si racconti la scena.

Co-Authored-By: Claude Opus 5 <noreply@anthropic.com>
</commit_message>
<xml_diff>
--- a/VOLT_Bibbia.docx
+++ b/VOLT_Bibbia.docx
@@ -5324,13 +5324,13 @@
         <w:t>non versano tutto</w:t>
       </w:r>
       <w:r>
-        <w:t xml:space="preserve">. Deviano un filo di corrente nel suo nucleo — e quel filo non gli ricostruisce un corpo: </w:t>
+        <w:t xml:space="preserve">. Deviano un filo di corrente verso di lui — non per ricostruirgli un corpo, ma per </w:t>
       </w:r>
       <w:r>
         <w:rPr>
           <w:b/>
         </w:rPr>
-        <w:t>entra dentro Ampere</w:t>
+        <w:t>raccoglierne la scintilla</w:t>
       </w:r>
       <w:r>
         <w:t>.</w:t>
@@ -5338,16 +5338,52 @@
     </w:p>
     <w:p>
       <w:r>
-        <w:t xml:space="preserve">Il corpo di schegge si disfa. Poi, dal vetro della lanterna, </w:t>
+        <w:t xml:space="preserve">Il tragitto si vede: un punto di luce lascia il petto di ECHO-0, attraversa l'aria ed </w:t>
       </w:r>
       <w:r>
         <w:rPr>
           <w:b/>
         </w:rPr>
+        <w:t>entra nel vetro di Ampere</w:t>
+      </w:r>
+      <w:r>
+        <w:t>. Solo allora il corpo di schegge si disfa e cade.</w:t>
+      </w:r>
+    </w:p>
+    <w:p>
+      <w:r>
+        <w:t xml:space="preserve">Poi, dalla lanterna, </w:t>
+      </w:r>
+      <w:r>
+        <w:rPr>
+          <w:b/>
+        </w:rPr>
         <w:t>esce una piccola sfera che fluttua: metà luce e metà ombra, come un'eclissi</w:t>
       </w:r>
       <w:r>
         <w:t>. Gira una volta intorno ai due, e li segue.</w:t>
+      </w:r>
+    </w:p>
+    <w:p>
+      <w:pPr>
+        <w:spacing w:before="160" w:after="200"/>
+        <w:ind w:left="340"/>
+        <w:pBdr>
+          <w:left w:val="single" w:sz="18" w:space="10" w:color="7A3FD6"/>
+        </w:pBdr>
+      </w:pPr>
+      <w:r>
+        <w:rPr>
+          <w:b/>
+          <w:sz w:val="21"/>
+        </w:rPr>
+        <w:t>Il passaggio della scintilla non è un dettaglio: è quello che dice allo spettatore che Eclio è ECHO-0.</w:t>
+      </w:r>
+      <w:r>
+        <w:rPr>
+          <w:sz w:val="21"/>
+        </w:rPr>
+        <w:t xml:space="preserve"> In qualunque media si racconti questa scena, quel tragitto va mostrato.</w:t>
       </w:r>
     </w:p>
     <w:p>

</xml_diff>

<commit_message>
ECHO-0 non sparisce piu' per trenta settori: viene con loro
Buco trovato controllando: si arrendeva al 35, apriva il passaggio e poi
non si vedeva piu' fino al 65, dove ricompariva per farsi salvare. Meta'
atto senza il personaggio piu' importante, e un finale in cui salvi uno
che non vedi da due ore.

Adesso dal 36 al 56 e' un compagno scomodo: cammina davanti, apre
passaggi, avvisa, sparisce e ricompare, e per venti settori il giocatore
si chiede quando lo tradira'. Nel gioco costa poco — una sagoma sullo
sfondo che indica la strada, non combatte e non si comanda.

E gli abbiamo dato il suo momento: al settore 56, quando ECHO-1 cade e
Ampere torna piena, lui e' a un passo, allunga la mano e la ritira. E'
li' che sceglie, non nel finale. Senza quella battuta salvarlo alla fine
e' un regalo; con quella, e' un debito.

Di conseguenza il filmato del 56 diventa essenziale e ha tre battute
invece di una.

Co-Authored-By: Claude Opus 5 <noreply@anthropic.com>
</commit_message>
<xml_diff>
--- a/VOLT_Bibbia.docx
+++ b/VOLT_Bibbia.docx
@@ -2368,8 +2368,84 @@
         </w:rPr>
         <w:t>Ve la indica lo stesso.</w:t>
       </w:r>
-      <w:r>
-        <w:t xml:space="preserve"> Da quel momento non è più il nemico: è uno che si è già arreso a morire per voi, e alla fine sarete voi a non lasciarlo andare.</w:t>
+    </w:p>
+    <w:p>
+      <w:pPr>
+        <w:pStyle w:val="Heading3"/>
+      </w:pPr>
+      <w:r>
+        <w:t>Il compagno scomodo (settori 36-56) [SCRITTO]</w:t>
+      </w:r>
+    </w:p>
+    <w:p>
+      <w:r>
+        <w:t xml:space="preserve">Da lì in poi </w:t>
+      </w:r>
+      <w:r>
+        <w:rPr>
+          <w:b/>
+        </w:rPr>
+        <w:t>non sparisce: viene con voi.</w:t>
+      </w:r>
+      <w:r>
+        <w:t xml:space="preserve"> Non come alleato — la lanterna la rivuole anche lui, per il motivo opposto al vostro. Cammina avanti, apre passaggi, avvisa quando c'è un pericolo, ogni tanto si dilegua e non si sa se tornerà.</w:t>
+      </w:r>
+    </w:p>
+    <w:p>
+      <w:r>
+        <w:t xml:space="preserve">Per venti settori il giocatore ha in testa una domanda sola: </w:t>
+      </w:r>
+      <w:r>
+        <w:rPr>
+          <w:b/>
+        </w:rPr>
+        <w:t>quando mi tradisce?</w:t>
+      </w:r>
+    </w:p>
+    <w:p>
+      <w:r>
+        <w:rPr>
+          <w:b/>
+        </w:rPr>
+        <w:t>Come si gioca.</w:t>
+      </w:r>
+      <w:r>
+        <w:t xml:space="preserve"> Non combatte e non si comanda. Compare sullo sfondo — una sagoma nera su un'isola lontana, sul bordo di un dirupo, dentro un varco — e ogni tanto indica una direzione. Costa poco e cambia tutto: il settore non è più vuoto, c'è qualcuno.</w:t>
+      </w:r>
+    </w:p>
+    <w:p>
+      <w:pPr>
+        <w:pStyle w:val="Heading3"/>
+      </w:pPr>
+      <w:r>
+        <w:t>La scelta (settore 56) [SCRITTO]</w:t>
+      </w:r>
+    </w:p>
+    <w:p>
+      <w:r>
+        <w:t xml:space="preserve">Quando ECHO-1 cade e </w:t>
+      </w:r>
+      <w:r>
+        <w:rPr>
+          <w:b/>
+        </w:rPr>
+        <w:t>Ampere torna piena</w:t>
+      </w:r>
+      <w:r>
+        <w:t>, ECHO-0 è lì. Potrebbe prenderla e sparire: è l'unica cosa che ha voluto dall'inizio, ed è a un passo.</w:t>
+      </w:r>
+    </w:p>
+    <w:p>
+      <w:r>
+        <w:rPr>
+          <w:b/>
+        </w:rPr>
+        <w:t>Non lo fa.</w:t>
+      </w:r>
+    </w:p>
+    <w:p>
+      <w:r>
+        <w:t>È qui che sceglie — non al finale. Al settore 65 i due Custodi non fanno altro che ricambiare. Senza questo momento, salvarlo alla fine sarebbe un regalo; con questo momento, è un debito.</w:t>
       </w:r>
     </w:p>
     <w:p>
@@ -5026,6 +5102,26 @@
     </w:p>
     <w:p>
       <w:r>
+        <w:rPr>
+          <w:b/>
+        </w:rPr>
+        <w:t>E non si va da soli.</w:t>
+      </w:r>
+      <w:r>
+        <w:t xml:space="preserve"> ECHO-0 viene con voi — non al vostro fianco, davanti a voi: apre passaggi, avvisa, sparisce e ricompare. Non si sa mai se sta portando i Custodi dove serve o dove conviene a lui. È la tensione che regge questi venti settori (vedi </w:t>
+      </w:r>
+      <w:r>
+        <w:rPr>
+          <w:i/>
+        </w:rPr>
+        <w:t>Il compagno scomodo</w:t>
+      </w:r>
+      <w:r>
+        <w:t>, capitolo 4).</w:t>
+      </w:r>
+    </w:p>
+    <w:p>
+      <w:r>
         <w:t xml:space="preserve">Ampere non ce l'hai. La corrente </w:t>
       </w:r>
       <w:r>
@@ -5086,6 +5182,17 @@
       </w:r>
       <w:r>
         <w:t xml:space="preserve"> — e tutta la corrente che ti sei portato addosso per venti settori le entra dentro in un colpo solo.</w:t>
+      </w:r>
+    </w:p>
+    <w:p>
+      <w:r>
+        <w:rPr>
+          <w:b/>
+        </w:rPr>
+        <w:t>E ECHO-0 è lì, a un passo, e non la prende.</w:t>
+      </w:r>
+      <w:r>
+        <w:t xml:space="preserve"> È il momento in cui sceglie: tutto quello che succede al settore 65 nasce da qui.</w:t>
       </w:r>
     </w:p>
     <w:p>
@@ -5757,7 +5864,7 @@
               <w:rPr>
                 <w:sz w:val="20"/>
               </w:rPr>
-              <w:t>Fatica</w:t>
+              <w:t>Fatica e sospetto</w:t>
             </w:r>
           </w:p>
         </w:tc>
@@ -5779,7 +5886,7 @@
               <w:rPr>
                 <w:sz w:val="20"/>
               </w:rPr>
-              <w:t>Portarsi addosso una cosa che non si può contenere</w:t>
+              <w:t>Portarsi addosso una cosa che non si può contenere, con accanto uno di cui non ti fidi</w:t>
             </w:r>
           </w:p>
         </w:tc>
@@ -5802,7 +5909,7 @@
               <w:rPr>
                 <w:sz w:val="20"/>
               </w:rPr>
-              <w:t>La Caldera</w:t>
+              <w:t>Settore 56</w:t>
             </w:r>
           </w:p>
         </w:tc>
@@ -5823,13 +5930,81 @@
               <w:rPr>
                 <w:sz w:val="20"/>
               </w:rPr>
-              <w:t>Compassione</w:t>
+              <w:t>La scelta di lui</w:t>
             </w:r>
           </w:p>
         </w:tc>
         <w:tc>
           <w:tcPr>
             <w:tcW w:type="dxa" w:w="3173"/>
+          </w:tcPr>
+          <w:p>
+            <w:pPr>
+              <w:spacing w:after="40"/>
+            </w:pPr>
+            <w:r>
+              <w:rPr>
+                <w:sz w:val="20"/>
+              </w:rPr>
+            </w:r>
+            <w:r>
+              <w:rPr>
+                <w:sz w:val="20"/>
+              </w:rPr>
+              <w:t>Potrebbe prendersi la lanterna e non lo fa</w:t>
+            </w:r>
+          </w:p>
+        </w:tc>
+      </w:tr>
+      <w:tr>
+        <w:tc>
+          <w:tcPr>
+            <w:tcW w:type="dxa" w:w="3173"/>
+            <w:shd w:val="clear" w:fill="F1EFF8"/>
+          </w:tcPr>
+          <w:p>
+            <w:pPr>
+              <w:spacing w:after="40"/>
+            </w:pPr>
+            <w:r>
+              <w:rPr>
+                <w:sz w:val="20"/>
+              </w:rPr>
+            </w:r>
+            <w:r>
+              <w:rPr>
+                <w:sz w:val="20"/>
+              </w:rPr>
+              <w:t>La Caldera</w:t>
+            </w:r>
+          </w:p>
+        </w:tc>
+        <w:tc>
+          <w:tcPr>
+            <w:tcW w:type="dxa" w:w="3173"/>
+            <w:shd w:val="clear" w:fill="F1EFF8"/>
+          </w:tcPr>
+          <w:p>
+            <w:pPr>
+              <w:spacing w:after="40"/>
+            </w:pPr>
+            <w:r>
+              <w:rPr>
+                <w:sz w:val="20"/>
+              </w:rPr>
+            </w:r>
+            <w:r>
+              <w:rPr>
+                <w:sz w:val="20"/>
+              </w:rPr>
+              <w:t>Compassione</w:t>
+            </w:r>
+          </w:p>
+        </w:tc>
+        <w:tc>
+          <w:tcPr>
+            <w:tcW w:type="dxa" w:w="3173"/>
+            <w:shd w:val="clear" w:fill="F1EFF8"/>
           </w:tcPr>
           <w:p>
             <w:pPr>

</xml_diff>

<commit_message>
Riallineati i conteggi nei tre documenti
Tre refusi segnalati dal Capo, piu' uno trovato controllando:

- DA-FARE.md diceva "LE NOVE SCHEDE" ma sono dieci;
- COME-FARE-I-VIDEO.txt teneva la_luce_se_ne_va fra quelli da fare,
  mentre e' nel gioco dalla v36;
- lo stesso file parlava dei "primi quattro essenziali", che adesso sono
  sei e non stanno piu' in testa alla lista;
- e nella Bibbia l'introduzione della tabella diceva ancora "in ordine di
  importanza, i primi quattro essenziali", mentre la tabella e' in ordine
  di settore.

L'elenco accanto ai video adesso e' in ordine di settore, segna gli
essenziali con [E] invece di affidarsi alla posizione, e mostra le tre
coppie. Sistemata anche la regola del peso, che citava un conteggio
vecchio e non diceva dell'eccezione dell'introduzione.

Co-Authored-By: Claude Opus 5 <noreply@anthropic.com>
</commit_message>
<xml_diff>
--- a/VOLT_Bibbia.docx
+++ b/VOLT_Bibbia.docx
@@ -11199,19 +11199,19 @@
         <w:rPr>
           <w:b/>
         </w:rPr>
-        <w:t>Da fare</w:t>
-      </w:r>
-      <w:r>
-        <w:t xml:space="preserve">, in ordine di importanza. I primi quattro sono </w:t>
+        <w:t>Da fare: dieci</w:t>
+      </w:r>
+      <w:r>
+        <w:t xml:space="preserve">, qui in ordine di settore. I sei segnati </w:t>
       </w:r>
       <w:r>
         <w:rPr>
           <w:b/>
         </w:rPr>
-        <w:t>essenziali</w:t>
-      </w:r>
-      <w:r>
-        <w:t>: senza di loro la storia non si capisce. Gli altri fanno bella figura.</w:t>
+        <w:t>essenziale</w:t>
+      </w:r>
+      <w:r>
+        <w:t xml:space="preserve"> sono quelli senza cui la storia non si capisce; gli altri fanno bella figura.</w:t>
       </w:r>
     </w:p>
     <w:tbl>
@@ -12668,13 +12668,28 @@
         <w:rPr>
           <w:b/>
         </w:rPr>
-        <w:t>massimo 3 MB l'uno.</w:t>
-      </w:r>
-      <w:r>
-        <w:t xml:space="preserve"> Il gioco intero pesa poco più di un mega:</w:t>
-      </w:r>
-      <w:r>
-        <w:t xml:space="preserve"> quattro video da dieci lo renderebbero lentissimo da aprire in mobilità.</w:t>
+        <w:t>massimo 3 MB l'uno</w:t>
+      </w:r>
+      <w:r>
+        <w:t xml:space="preserve"> (l'introduzione è l'unica eccezione, 4,5 MB,</w:t>
+      </w:r>
+      <w:r>
+        <w:t xml:space="preserve"> perché si scarica mentre il giocatore guarda una schermata ferma). La pagina</w:t>
+      </w:r>
+      <w:r>
+        <w:t xml:space="preserve"> del gioco pesa poco più di un mega e i filmati si caricano solo quando</w:t>
+      </w:r>
+      <w:r>
+        <w:t xml:space="preserve"> servono: se pesassero dieci mega l'uno, ognuno sarebbe un'attesa nera nel</w:t>
+      </w:r>
+      <w:r>
+        <w:t xml:space="preserve"> momento peggiore. </w:t>
+      </w:r>
+      <w:r>
+        <w:rPr>
+          <w:b/>
+        </w:rPr>
+        <w:t>Mandali pure pesanti: li ricomprimo io.</w:t>
       </w:r>
     </w:p>
     <w:p>

</xml_diff>

<commit_message>
v48 — Lumina dipinta, il marchio, e i Silenti
I cinque fondali di Lumina diventano il fondale vero dei primi venti
settori: Prateria Cromo, Deserto Solare, Laguna Profonda, Giardino Viola
e Ghiacciaio. Con la Frattura fanno sei mondi dipinti su sei.

- ogni tema ha il suo `sfondo` e il suo `velo`: sui mondi chiari il velo
  e' una foschia chiara, allontana il dipinto invece di sporcarlo
- i colori del terreno ripresi dai dipinti stessi, un gradino piu' su
- l'emblema tondo di VOLT al posto del titolo scritto: grande sulla
  schermata del titolo, in riga nel menu, e come icona della scheda
- le sei immagini di scena archiviate in assets/riferimenti/scene/
- i SILENTI nella Bibbia: le quattro sagome del rapimento di Aren
  tornano al settore 56 accanto a ECHO-1

Co-Authored-By: Claude Opus 5 <noreply@anthropic.com>
</commit_message>
<xml_diff>
--- a/VOLT_Bibbia.docx
+++ b/VOLT_Bibbia.docx
@@ -4466,6 +4466,337 @@
         <w:pStyle w:val="Heading2"/>
       </w:pPr>
       <w:r>
+        <w:t>I SILENTI — le ombre che guardano [SCRITTO]</w:t>
+      </w:r>
+    </w:p>
+    <w:p>
+      <w:r>
+        <w:t xml:space="preserve">Sono già nel gioco, e nessuno se n'è accorto. Nel filmato del rapimento di Aren, </w:t>
+      </w:r>
+      <w:r>
+        <w:rPr>
+          <w:b/>
+        </w:rPr>
+        <w:t>dietro alla scena, in piedi, ci sono quattro sagome umane scure</w:t>
+      </w:r>
+      <w:r>
+        <w:t xml:space="preserve"> che non fanno niente. Guardano. Poi il cielo si chiude e non si vedono più.</w:t>
+      </w:r>
+    </w:p>
+    <w:p>
+      <w:r>
+        <w:t xml:space="preserve">Al settore 56 tornano, e combattono </w:t>
+      </w:r>
+      <w:r>
+        <w:rPr>
+          <w:b/>
+        </w:rPr>
+        <w:t>accanto a ECHO-1</w:t>
+      </w:r>
+      <w:r>
+        <w:t>.</w:t>
+      </w:r>
+    </w:p>
+    <w:p>
+      <w:r>
+        <w:rPr>
+          <w:b/>
+        </w:rPr>
+        <w:t>Come si disegnano.</w:t>
+      </w:r>
+      <w:r>
+        <w:t xml:space="preserve"> Esattamente come nel filmato, o non serve a niente:</w:t>
+      </w:r>
+    </w:p>
+    <w:p>
+      <w:pPr>
+        <w:pStyle w:val="ListBullet"/>
+      </w:pPr>
+      <w:r>
+        <w:rPr>
+          <w:b/>
+        </w:rPr>
+        <w:t>sagome umane</w:t>
+      </w:r>
+      <w:r>
+        <w:t xml:space="preserve">, in piedi, proporzioni da persona ma </w:t>
+      </w:r>
+      <w:r>
+        <w:rPr>
+          <w:b/>
+        </w:rPr>
+        <w:t>allungate</w:t>
+      </w:r>
+      <w:r>
+        <w:t xml:space="preserve"> — braccia</w:t>
+      </w:r>
+      <w:r>
+        <w:t xml:space="preserve"> lunghe, spalle strette, testa piccola;</w:t>
+      </w:r>
+    </w:p>
+    <w:p>
+      <w:pPr>
+        <w:pStyle w:val="ListBullet"/>
+      </w:pPr>
+      <w:r>
+        <w:rPr>
+          <w:b/>
+        </w:rPr>
+        <w:t>nessun volto</w:t>
+      </w:r>
+      <w:r>
+        <w:t>: niente occhi, niente bocca, niente naso;</w:t>
+      </w:r>
+    </w:p>
+    <w:p>
+      <w:pPr>
+        <w:pStyle w:val="ListBullet"/>
+      </w:pPr>
+      <w:r>
+        <w:rPr>
+          <w:b/>
+        </w:rPr>
+        <w:t>nessun vestito e nessun dettaglio</w:t>
+      </w:r>
+      <w:r>
+        <w:t>: sono una silhouette piena, viola-nera e</w:t>
+      </w:r>
+      <w:r>
+        <w:t xml:space="preserve"> un po' trasparente, come vetro fumé;</w:t>
+      </w:r>
+    </w:p>
+    <w:p>
+      <w:pPr>
+        <w:pStyle w:val="ListBullet"/>
+      </w:pPr>
+      <w:r>
+        <w:rPr>
+          <w:b/>
+        </w:rPr>
+        <w:t>il contorno prende luce</w:t>
+      </w:r>
+      <w:r>
+        <w:t xml:space="preserve"> da quello che hanno dietro: nella Frattura si</w:t>
+      </w:r>
+      <w:r>
+        <w:t xml:space="preserve"> accendono di viola, in Eclissia di verde;</w:t>
+      </w:r>
+    </w:p>
+    <w:p>
+      <w:pPr>
+        <w:pStyle w:val="ListBullet"/>
+      </w:pPr>
+      <w:r>
+        <w:rPr>
+          <w:b/>
+        </w:rPr>
+        <w:t>stanno fermi e dritti</w:t>
+      </w:r>
+      <w:r>
+        <w:t>, con le braccia lungo i fianchi. Non minacciano.</w:t>
+      </w:r>
+      <w:r>
+        <w:t xml:space="preserve"> È quello che fa paura.</w:t>
+      </w:r>
+    </w:p>
+    <w:p>
+      <w:r>
+        <w:rPr>
+          <w:b/>
+        </w:rPr>
+        <w:t>Chi sono.</w:t>
+      </w:r>
+      <w:r>
+        <w:t xml:space="preserve"> Gli abitanti di Eclissia. Il loro mondo è illuminato al contrario e loro sono quello che resta di chi ci vive: </w:t>
+      </w:r>
+      <w:r>
+        <w:rPr>
+          <w:b/>
+        </w:rPr>
+        <w:t>persone senza luce dentro</w:t>
+      </w:r>
+      <w:r>
+        <w:t>. Quando la prima Frattura si è aperta ne sono passati alcuni, e sono rimasti dalla parte sbagliata.</w:t>
+      </w:r>
+    </w:p>
+    <w:p>
+      <w:r>
+        <w:rPr>
+          <w:b/>
+        </w:rPr>
+        <w:t>Cosa vogliono.</w:t>
+      </w:r>
+      <w:r>
+        <w:t xml:space="preserve"> Una cosa sola: </w:t>
+      </w:r>
+      <w:r>
+        <w:rPr>
+          <w:b/>
+        </w:rPr>
+        <w:t>stare vicino ad Ampere.</w:t>
+      </w:r>
+      <w:r>
+        <w:t xml:space="preserve"> Non la rubano, non la toccano. Le vanno incontro come ci si mette vicino a una stufa. Per questo erano lì la notte del rapimento — non guardavano i due Custodi, </w:t>
+      </w:r>
+      <w:r>
+        <w:rPr>
+          <w:b/>
+        </w:rPr>
+        <w:t>guardavano la lanterna</w:t>
+      </w:r>
+      <w:r>
+        <w:t>.</w:t>
+      </w:r>
+    </w:p>
+    <w:p>
+      <w:pPr>
+        <w:spacing w:before="160" w:after="200"/>
+        <w:ind w:left="340"/>
+        <w:pBdr>
+          <w:left w:val="single" w:sz="18" w:space="10" w:color="7A3FD6"/>
+        </w:pBdr>
+      </w:pPr>
+      <w:r>
+        <w:rPr>
+          <w:b/>
+          <w:sz w:val="21"/>
+        </w:rPr>
+        <w:t>La regola dei Silenti, e vale sempre.</w:t>
+      </w:r>
+      <w:r>
+        <w:rPr>
+          <w:sz w:val="21"/>
+        </w:rPr>
+        <w:t xml:space="preserve"> </w:t>
+      </w:r>
+      <w:r>
+        <w:rPr>
+          <w:b/>
+          <w:sz w:val="21"/>
+        </w:rPr>
+        <w:t>Non stanno con nessuno: stanno con chi ha Ampere in mano.</w:t>
+      </w:r>
+      <w:r>
+        <w:rPr>
+          <w:sz w:val="21"/>
+        </w:rPr>
+        <w:t xml:space="preserve"> Al settore 56 Ampere è nel petto di ECHO-1, e loro difendono ECHO-1. Appena la lanterna torna ai Custodi, </w:t>
+      </w:r>
+      <w:r>
+        <w:rPr>
+          <w:b/>
+          <w:sz w:val="21"/>
+        </w:rPr>
+        <w:t>smettono di combattere e si voltano verso di loro</w:t>
+      </w:r>
+      <w:r>
+        <w:rPr>
+          <w:sz w:val="21"/>
+        </w:rPr>
+        <w:t>.</w:t>
+      </w:r>
+    </w:p>
+    <w:p>
+      <w:r>
+        <w:rPr>
+          <w:b/>
+        </w:rPr>
+        <w:t>Come si combattono (settore 56).</w:t>
+      </w:r>
+      <w:r>
+        <w:t xml:space="preserve"> Sono quattro e sono il contorno dello scontro, non lo scontro: non sparano, </w:t>
+      </w:r>
+      <w:r>
+        <w:rPr>
+          <w:b/>
+        </w:rPr>
+        <w:t>camminano addosso</w:t>
+      </w:r>
+      <w:r>
+        <w:t xml:space="preserve"> e con le braccia lunghe cercano di bloccarti — chi resta preso non spara per un secondo. Si buttano giù con due colpi. Il problema è che </w:t>
+      </w:r>
+      <w:r>
+        <w:rPr>
+          <w:b/>
+        </w:rPr>
+        <w:t>tornano in piedi</w:t>
+      </w:r>
+      <w:r>
+        <w:t xml:space="preserve"> finché ECHO-1 ha almeno un cristallo acceso, e ne restano fermi tanti quanti sono i cristalli: tre cristalli, tre Silenti in piedi; ultimo cristallo, ne resta uno solo. </w:t>
+      </w:r>
+      <w:r>
+        <w:rPr>
+          <w:b/>
+        </w:rPr>
+        <w:t>Contarli è il modo di capire quanto manca.</w:t>
+      </w:r>
+    </w:p>
+    <w:p>
+      <w:r>
+        <w:t>Quando l'ultimo cristallo si spegne, si fermano tutti e quattro in piedi, e restano lì mentre Ampere torna ai Custodi.</w:t>
+      </w:r>
+    </w:p>
+    <w:p>
+      <w:r>
+        <w:rPr>
+          <w:b/>
+        </w:rPr>
+        <w:t>E poi?</w:t>
+      </w:r>
+      <w:r>
+        <w:t xml:space="preserve"> Salgono. Da lontano, dietro, senza mai raggiungerli: nei nove settori della Caldera si vedono </w:t>
+      </w:r>
+      <w:r>
+        <w:rPr>
+          <w:b/>
+        </w:rPr>
+        <w:t>in fondo alle piattaforme, fermi</w:t>
+      </w:r>
+      <w:r>
+        <w:t>, sempre di più. Alla cima sono decine. Non attaccano mai. Aspettano la lanterna.</w:t>
+      </w:r>
+    </w:p>
+    <w:p>
+      <w:r>
+        <w:t xml:space="preserve">Nel finale, quando Ampere si riaccende, </w:t>
+      </w:r>
+      <w:r>
+        <w:rPr>
+          <w:b/>
+        </w:rPr>
+        <w:t>si accendono anche loro</w:t>
+      </w:r>
+      <w:r>
+        <w:t xml:space="preserve"> — e per la prima volta hanno un colore. È il modo più semplice di far vedere che riaccendere Lumina serviva anche a qualcun altro.</w:t>
+      </w:r>
+    </w:p>
+    <w:p>
+      <w:pPr>
+        <w:spacing w:before="160" w:after="200"/>
+        <w:ind w:left="340"/>
+        <w:pBdr>
+          <w:left w:val="single" w:sz="18" w:space="10" w:color="7A3FD6"/>
+        </w:pBdr>
+      </w:pPr>
+      <w:r>
+        <w:rPr>
+          <w:b/>
+          <w:sz w:val="21"/>
+        </w:rPr>
+        <w:t>Il nome è una proposta.</w:t>
+      </w:r>
+      <w:r>
+        <w:rPr>
+          <w:sz w:val="21"/>
+        </w:rPr>
+        <w:t xml:space="preserve"> «Silenti» descrive quello che fanno: guardano e non parlano mai. Se ne salta fuori uno migliore, si cambia qui e in tutti i file — sono l'unica cosa di questo capitolo ancora da approvare.</w:t>
+      </w:r>
+    </w:p>
+    <w:p>
+      <w:pPr>
+        <w:pStyle w:val="Heading2"/>
+      </w:pPr>
+      <w:r>
         <w:t>I mostri comuni [GIOCO]</w:t>
       </w:r>
     </w:p>
@@ -4600,6 +4931,35 @@
     <w:p>
       <w:r>
         <w:t>Finisce esattamente dove comincia il gioco: il cielo che si spacca.</w:t>
+      </w:r>
+    </w:p>
+    <w:p>
+      <w:r>
+        <w:rPr>
+          <w:b/>
+        </w:rPr>
+        <w:t>E in quel momento, dietro, c'è già qualcuno.</w:t>
+      </w:r>
+      <w:r>
+        <w:t xml:space="preserve"> Nel filmato del rapimento si vedono </w:t>
+      </w:r>
+      <w:r>
+        <w:rPr>
+          <w:b/>
+        </w:rPr>
+        <w:t>quattro sagome umane scure</w:t>
+      </w:r>
+      <w:r>
+        <w:t xml:space="preserve">, in piedi, che non intervengono e non scappano: sono i </w:t>
+      </w:r>
+      <w:r>
+        <w:rPr>
+          <w:b/>
+        </w:rPr>
+        <w:t>Silenti</w:t>
+      </w:r>
+      <w:r>
+        <w:t>, ed è la prima volta che si vedono. Chi gioca li prende per un dettaglio dello sfondo. Torneranno al settore 56.</w:t>
       </w:r>
     </w:p>
     <w:p>
@@ -6246,6 +6606,53 @@
     </w:p>
     <w:p>
       <w:r>
+        <w:rPr>
+          <w:b/>
+        </w:rPr>
+        <w:t>E non è solo.</w:t>
+      </w:r>
+      <w:r>
+        <w:t xml:space="preserve"> Intorno a lui ci sono </w:t>
+      </w:r>
+      <w:r>
+        <w:rPr>
+          <w:b/>
+        </w:rPr>
+        <w:t>quattro Silenti</w:t>
+      </w:r>
+      <w:r>
+        <w:t xml:space="preserve"> — le stesse sagome umane scure che si vedevano dietro al rapimento, all'inizio del gioco. Non sparano: camminano addosso e cercano di bloccarti con le braccia. Si buttano giù con due colpi, ma </w:t>
+      </w:r>
+      <w:r>
+        <w:rPr>
+          <w:b/>
+        </w:rPr>
+        <w:t>si rialzano finché ECHO-1 ha un cristallo acceso</w:t>
+      </w:r>
+      <w:r>
+        <w:t xml:space="preserve">, e ne restano in piedi tanti quanti sono i cristalli. Non difendono ECHO-1: difendono </w:t>
+      </w:r>
+      <w:r>
+        <w:rPr>
+          <w:b/>
+        </w:rPr>
+        <w:t>Ampere</w:t>
+      </w:r>
+      <w:r>
+        <w:t xml:space="preserve">, che ce l'ha lui nel petto (vedi </w:t>
+      </w:r>
+      <w:r>
+        <w:rPr>
+          <w:i/>
+        </w:rPr>
+        <w:t>I Silenti</w:t>
+      </w:r>
+      <w:r>
+        <w:t>, capitolo 4).</w:t>
+      </w:r>
+    </w:p>
+    <w:p>
+      <w:r>
         <w:t xml:space="preserve">Quando cade, </w:t>
       </w:r>
       <w:r>
@@ -6256,6 +6663,17 @@
       </w:r>
       <w:r>
         <w:t xml:space="preserve"> — e tutta la corrente che ti sei portato addosso per venti settori le entra dentro in un colpo solo.</w:t>
+      </w:r>
+    </w:p>
+    <w:p>
+      <w:r>
+        <w:rPr>
+          <w:b/>
+        </w:rPr>
+        <w:t>E i quattro Silenti si fermano</w:t>
+      </w:r>
+      <w:r>
+        <w:t xml:space="preserve"> e si voltano verso i Custodi. Da quel momento li seguono, sempre a distanza, fino alla cima.</w:t>
       </w:r>
     </w:p>
     <w:p>

</xml_diff>

<commit_message>
v50 — ampere_torna nel gioco, all'uscita dal settore 30
Il filmato dello strappo entra in campagna: si vede entrando nel 31,
perche' racconta come finisce lo scontro del 30.

- compresso da 32 MB a 2,5 MB (2 passate, 1280x720, faststart)
- l'originale in assets/video/orig/
- arrivato SENZA traccia audio: aggiunta FILMATI_MUTI, su quei filmati la
  musica del gioco non si ferma. Senza, erano otto secondi di silenzio
  totale e sembrava un blocco
- commessa e Bibbia allineate: fatti otto, da fare nove (sette essenziali)

Co-Authored-By: Claude Opus 5 <noreply@anthropic.com>
</commit_message>
<xml_diff>
--- a/VOLT_Bibbia.docx
+++ b/VOLT_Bibbia.docx
@@ -11516,7 +11516,7 @@
         <w:t>Fatti</w:t>
       </w:r>
       <w:r>
-        <w:t xml:space="preserve"> (già dentro il gioco, sette):</w:t>
+        <w:t xml:space="preserve"> (già dentro il gioco, otto):</w:t>
       </w:r>
     </w:p>
     <w:tbl>
@@ -12071,6 +12071,83 @@
           </w:p>
         </w:tc>
       </w:tr>
+      <w:tr>
+        <w:tc>
+          <w:tcPr>
+            <w:tcW w:type="dxa" w:w="3173"/>
+            <w:shd w:val="clear" w:fill="F1EFF8"/>
+          </w:tcPr>
+          <w:p>
+            <w:pPr>
+              <w:spacing w:after="40"/>
+            </w:pPr>
+            <w:r>
+              <w:rPr>
+                <w:sz w:val="20"/>
+              </w:rPr>
+            </w:r>
+            <w:r>
+              <w:rPr>
+                <w:rFonts w:ascii="Consolas" w:hAnsi="Consolas"/>
+                <w:color w:val="7A3FD6"/>
+                <w:sz w:val="20"/>
+              </w:rPr>
+              <w:t>ampere_torna</w:t>
+            </w:r>
+          </w:p>
+        </w:tc>
+        <w:tc>
+          <w:tcPr>
+            <w:tcW w:type="dxa" w:w="3173"/>
+            <w:shd w:val="clear" w:fill="F1EFF8"/>
+          </w:tcPr>
+          <w:p>
+            <w:pPr>
+              <w:spacing w:after="40"/>
+            </w:pPr>
+            <w:r>
+              <w:rPr>
+                <w:sz w:val="20"/>
+              </w:rPr>
+            </w:r>
+            <w:r>
+              <w:rPr>
+                <w:sz w:val="20"/>
+              </w:rPr>
+              <w:t>entrando nel settore 31</w:t>
+            </w:r>
+          </w:p>
+        </w:tc>
+        <w:tc>
+          <w:tcPr>
+            <w:tcW w:type="dxa" w:w="3173"/>
+            <w:shd w:val="clear" w:fill="F1EFF8"/>
+          </w:tcPr>
+          <w:p>
+            <w:pPr>
+              <w:spacing w:after="40"/>
+            </w:pPr>
+            <w:r>
+              <w:rPr>
+                <w:sz w:val="20"/>
+              </w:rPr>
+            </w:r>
+            <w:r>
+              <w:rPr>
+                <w:sz w:val="20"/>
+              </w:rPr>
+              <w:t xml:space="preserve">Lo strappo: la lanterna passa di mano, si accende di verde fra Aren e Lyra, ECHO-0 indietreggia e fugge nel varco. </w:t>
+            </w:r>
+            <w:r>
+              <w:rPr>
+                <w:b/>
+                <w:sz w:val="20"/>
+              </w:rPr>
+              <w:t>È muto</w:t>
+            </w:r>
+          </w:p>
+        </w:tc>
+      </w:tr>
     </w:tbl>
     <w:p/>
     <w:p>
@@ -12078,7 +12155,7 @@
         <w:rPr>
           <w:b/>
         </w:rPr>
-        <w:t>Da fare: dieci</w:t>
+        <w:t>Da fare: nove</w:t>
       </w:r>
       <w:r>
         <w:t xml:space="preserve">, qui in ordine di settore. I sette segnati </w:t>
@@ -12337,7 +12414,7 @@
               <w:rPr>
                 <w:sz w:val="20"/>
               </w:rPr>
-              <w:t>3</w:t>
+              <w:t>2</w:t>
             </w:r>
           </w:p>
         </w:tc>
@@ -12361,7 +12438,7 @@
                 <w:color w:val="7A3FD6"/>
                 <w:sz w:val="20"/>
               </w:rPr>
-              <w:t>ampere_torna</w:t>
+              <w:t>il_tradimento</w:t>
             </w:r>
           </w:p>
         </w:tc>
@@ -12383,7 +12460,7 @@
               <w:rPr>
                 <w:sz w:val="20"/>
               </w:rPr>
-              <w:t>30</w:t>
+              <w:t>35</w:t>
             </w:r>
           </w:p>
         </w:tc>
@@ -12405,7 +12482,7 @@
               <w:rPr>
                 <w:sz w:val="20"/>
               </w:rPr>
-              <w:t>Gliela strappano di mano; la lanterna si accende fra i due</w:t>
+              <w:t>ECHO-0 è in ginocchio con Ampere al petto; ECHO-1 gliela strappa e sparisce</w:t>
             </w:r>
           </w:p>
         </w:tc>
@@ -12425,9 +12502,10 @@
             </w:r>
             <w:r>
               <w:rPr>
-                <w:sz w:val="20"/>
-              </w:rPr>
-              <w:t>desiderabile</w:t>
+                <w:b/>
+                <w:sz w:val="20"/>
+              </w:rPr>
+              <w:t>essenziale</w:t>
             </w:r>
           </w:p>
         </w:tc>
@@ -12450,7 +12528,7 @@
               <w:rPr>
                 <w:sz w:val="20"/>
               </w:rPr>
-              <w:t>4</w:t>
+              <w:t>3</w:t>
             </w:r>
           </w:p>
         </w:tc>
@@ -12473,7 +12551,7 @@
                 <w:color w:val="7A3FD6"/>
                 <w:sz w:val="20"/>
               </w:rPr>
-              <w:t>il_tradimento</w:t>
+              <w:t>il_passaggio</w:t>
             </w:r>
           </w:p>
         </w:tc>
@@ -12515,7 +12593,7 @@
               <w:rPr>
                 <w:sz w:val="20"/>
               </w:rPr>
-              <w:t>ECHO-0 è in ginocchio con Ampere al petto; ECHO-1 gliela strappa e sparisce</w:t>
+              <w:t>Si rialza e apre la fenditura su Eclissia: «È DI LÀ»</w:t>
             </w:r>
           </w:p>
         </w:tc>
@@ -12561,7 +12639,7 @@
               <w:rPr>
                 <w:sz w:val="20"/>
               </w:rPr>
-              <w:t>5</w:t>
+              <w:t>4</w:t>
             </w:r>
           </w:p>
         </w:tc>
@@ -12585,7 +12663,7 @@
                 <w:color w:val="7A3FD6"/>
                 <w:sz w:val="20"/>
               </w:rPr>
-              <w:t>il_passaggio</w:t>
+              <w:t>eclissia</w:t>
             </w:r>
           </w:p>
         </w:tc>
@@ -12607,7 +12685,7 @@
               <w:rPr>
                 <w:sz w:val="20"/>
               </w:rPr>
-              <w:t>35</w:t>
+              <w:t>36</w:t>
             </w:r>
           </w:p>
         </w:tc>
@@ -12629,7 +12707,7 @@
               <w:rPr>
                 <w:sz w:val="20"/>
               </w:rPr>
-              <w:t>Si rialza e apre la fenditura su Eclissia: «È DI LÀ»</w:t>
+              <w:t>La prima immagine del mondo nuovo, con la Caldera all'orizzonte</w:t>
             </w:r>
           </w:p>
         </w:tc>
@@ -12649,10 +12727,9 @@
             </w:r>
             <w:r>
               <w:rPr>
-                <w:b/>
-                <w:sz w:val="20"/>
-              </w:rPr>
-              <w:t>essenziale</w:t>
+                <w:sz w:val="20"/>
+              </w:rPr>
+              <w:t>desiderabile</w:t>
             </w:r>
           </w:p>
         </w:tc>
@@ -12675,7 +12752,7 @@
               <w:rPr>
                 <w:sz w:val="20"/>
               </w:rPr>
-              <w:t>6</w:t>
+              <w:t>5</w:t>
             </w:r>
           </w:p>
         </w:tc>
@@ -12698,7 +12775,7 @@
                 <w:color w:val="7A3FD6"/>
                 <w:sz w:val="20"/>
               </w:rPr>
-              <w:t>eclissia</w:t>
+              <w:t>il_reattore</w:t>
             </w:r>
           </w:p>
         </w:tc>
@@ -12719,7 +12796,7 @@
               <w:rPr>
                 <w:sz w:val="20"/>
               </w:rPr>
-              <w:t>36</w:t>
+              <w:t>56</w:t>
             </w:r>
           </w:p>
         </w:tc>
@@ -12740,7 +12817,7 @@
               <w:rPr>
                 <w:sz w:val="20"/>
               </w:rPr>
-              <w:t>La prima immagine del mondo nuovo, con la Caldera all'orizzonte</w:t>
+              <w:t>I tre cristalli si spengono, Ampere esce e si riempie di colpo</w:t>
             </w:r>
           </w:p>
         </w:tc>
@@ -12759,9 +12836,10 @@
             </w:r>
             <w:r>
               <w:rPr>
-                <w:sz w:val="20"/>
-              </w:rPr>
-              <w:t>desiderabile</w:t>
+                <w:b/>
+                <w:sz w:val="20"/>
+              </w:rPr>
+              <w:t>essenziale</w:t>
             </w:r>
           </w:p>
         </w:tc>
@@ -12785,7 +12863,7 @@
               <w:rPr>
                 <w:sz w:val="20"/>
               </w:rPr>
-              <w:t>7</w:t>
+              <w:t>6</w:t>
             </w:r>
           </w:p>
         </w:tc>
@@ -12809,7 +12887,7 @@
                 <w:color w:val="7A3FD6"/>
                 <w:sz w:val="20"/>
               </w:rPr>
-              <w:t>il_reattore</w:t>
+              <w:t>la_scelta_di_echo</w:t>
             </w:r>
           </w:p>
         </w:tc>
@@ -12853,7 +12931,7 @@
               <w:rPr>
                 <w:sz w:val="20"/>
               </w:rPr>
-              <w:t>I tre cristalli si spengono, Ampere esce e si riempie di colpo</w:t>
+              <w:t>ECHO-0 allunga la mano verso la lanterna e la ritira</w:t>
             </w:r>
           </w:p>
         </w:tc>
@@ -12899,7 +12977,7 @@
               <w:rPr>
                 <w:sz w:val="20"/>
               </w:rPr>
-              <w:t>8</w:t>
+              <w:t>7</w:t>
             </w:r>
           </w:p>
         </w:tc>
@@ -12922,7 +13000,7 @@
                 <w:color w:val="7A3FD6"/>
                 <w:sz w:val="20"/>
               </w:rPr>
-              <w:t>la_scelta_di_echo</w:t>
+              <w:t>la_cima</w:t>
             </w:r>
           </w:p>
         </w:tc>
@@ -12943,7 +13021,7 @@
               <w:rPr>
                 <w:sz w:val="20"/>
               </w:rPr>
-              <w:t>56</w:t>
+              <w:t>65</w:t>
             </w:r>
           </w:p>
         </w:tc>
@@ -12964,7 +13042,7 @@
               <w:rPr>
                 <w:sz w:val="20"/>
               </w:rPr>
-              <w:t>ECHO-0 allunga la mano verso la lanterna e la ritira</w:t>
+              <w:t>OHM si condensa sopra il cratere; il segno Ω si accende</w:t>
             </w:r>
           </w:p>
         </w:tc>
@@ -13010,7 +13088,7 @@
               <w:rPr>
                 <w:sz w:val="20"/>
               </w:rPr>
-              <w:t>9</w:t>
+              <w:t>8</w:t>
             </w:r>
           </w:p>
         </w:tc>
@@ -13034,7 +13112,7 @@
                 <w:color w:val="7A3FD6"/>
                 <w:sz w:val="20"/>
               </w:rPr>
-              <w:t>la_cima</w:t>
+              <w:t>il_finale</w:t>
             </w:r>
           </w:p>
         </w:tc>
@@ -13078,7 +13156,7 @@
               <w:rPr>
                 <w:sz w:val="20"/>
               </w:rPr>
-              <w:t>OHM si condensa sopra il cratere; il segno Ω si accende</w:t>
+              <w:t>L'eruzione, il cielo che si cuce, la scintilla che entra in Ampere, Eclio</w:t>
             </w:r>
           </w:p>
         </w:tc>
@@ -13124,7 +13202,7 @@
               <w:rPr>
                 <w:sz w:val="20"/>
               </w:rPr>
-              <w:t>10</w:t>
+              <w:t>9</w:t>
             </w:r>
           </w:p>
         </w:tc>
@@ -13147,7 +13225,7 @@
                 <w:color w:val="7A3FD6"/>
                 <w:sz w:val="20"/>
               </w:rPr>
-              <w:t>il_finale</w:t>
+              <w:t>il_bacio</w:t>
             </w:r>
           </w:p>
         </w:tc>
@@ -13189,128 +13267,13 @@
               <w:rPr>
                 <w:sz w:val="20"/>
               </w:rPr>
-              <w:t>L'eruzione, il cielo che si cuce, la scintilla che entra in Ampere, Eclio</w:t>
+              <w:t>Aren si toglie il casco, lo lascia cadere, abbraccia e bacia Lyra</w:t>
             </w:r>
           </w:p>
         </w:tc>
         <w:tc>
           <w:tcPr>
             <w:tcW w:type="dxa" w:w="1904"/>
-          </w:tcPr>
-          <w:p>
-            <w:pPr>
-              <w:spacing w:after="40"/>
-            </w:pPr>
-            <w:r>
-              <w:rPr>
-                <w:sz w:val="20"/>
-              </w:rPr>
-            </w:r>
-            <w:r>
-              <w:rPr>
-                <w:b/>
-                <w:sz w:val="20"/>
-              </w:rPr>
-              <w:t>essenziale</w:t>
-            </w:r>
-          </w:p>
-        </w:tc>
-      </w:tr>
-      <w:tr>
-        <w:tc>
-          <w:tcPr>
-            <w:tcW w:type="dxa" w:w="1904"/>
-            <w:shd w:val="clear" w:fill="F1EFF8"/>
-          </w:tcPr>
-          <w:p>
-            <w:pPr>
-              <w:spacing w:after="40"/>
-            </w:pPr>
-            <w:r>
-              <w:rPr>
-                <w:sz w:val="20"/>
-              </w:rPr>
-            </w:r>
-            <w:r>
-              <w:rPr>
-                <w:sz w:val="20"/>
-              </w:rPr>
-              <w:t>11</w:t>
-            </w:r>
-          </w:p>
-        </w:tc>
-        <w:tc>
-          <w:tcPr>
-            <w:tcW w:type="dxa" w:w="1904"/>
-            <w:shd w:val="clear" w:fill="F1EFF8"/>
-          </w:tcPr>
-          <w:p>
-            <w:pPr>
-              <w:spacing w:after="40"/>
-            </w:pPr>
-            <w:r>
-              <w:rPr>
-                <w:sz w:val="20"/>
-              </w:rPr>
-            </w:r>
-            <w:r>
-              <w:rPr>
-                <w:rFonts w:ascii="Consolas" w:hAnsi="Consolas"/>
-                <w:color w:val="7A3FD6"/>
-                <w:sz w:val="20"/>
-              </w:rPr>
-              <w:t>il_bacio</w:t>
-            </w:r>
-          </w:p>
-        </w:tc>
-        <w:tc>
-          <w:tcPr>
-            <w:tcW w:type="dxa" w:w="1904"/>
-            <w:shd w:val="clear" w:fill="F1EFF8"/>
-          </w:tcPr>
-          <w:p>
-            <w:pPr>
-              <w:spacing w:after="40"/>
-            </w:pPr>
-            <w:r>
-              <w:rPr>
-                <w:sz w:val="20"/>
-              </w:rPr>
-            </w:r>
-            <w:r>
-              <w:rPr>
-                <w:sz w:val="20"/>
-              </w:rPr>
-              <w:t>65</w:t>
-            </w:r>
-          </w:p>
-        </w:tc>
-        <w:tc>
-          <w:tcPr>
-            <w:tcW w:type="dxa" w:w="1904"/>
-            <w:shd w:val="clear" w:fill="F1EFF8"/>
-          </w:tcPr>
-          <w:p>
-            <w:pPr>
-              <w:spacing w:after="40"/>
-            </w:pPr>
-            <w:r>
-              <w:rPr>
-                <w:sz w:val="20"/>
-              </w:rPr>
-            </w:r>
-            <w:r>
-              <w:rPr>
-                <w:sz w:val="20"/>
-              </w:rPr>
-              <w:t>Aren si toglie il casco, lo lascia cadere, abbraccia e bacia Lyra</w:t>
-            </w:r>
-          </w:p>
-        </w:tc>
-        <w:tc>
-          <w:tcPr>
-            <w:tcW w:type="dxa" w:w="1904"/>
-            <w:shd w:val="clear" w:fill="F1EFF8"/>
           </w:tcPr>
           <w:p>
             <w:pPr>

</xml_diff>

<commit_message>
v60 — la caccia arriva in fondo: settori 28, 29 e 30
Il tratto giocabile si chiude dove doveva chiudersi da sempre, cioe' col
momento per cui la caccia esisteva: la lanterna che torna.

- 28 e 29: le ultime due tappe dell'inseguimento, con le apparizioni
- 30: il terzo scontro. ECHO-0 alla terza mano (351 di vita contro 130
  del primo incontro) e stavolta la fuga non gli riesce — "STAVOLTA NO",
  il potere glielo riprendi invece di fartelo restituire, lampo verde e
  "AMPERE E' TORNATA"
- finito il 30 parte `ampere_torna` e SOLO DOPO la schermata di fine
  tratto: il filmato racconta come e' finito quel settore, fermarsi
  prima avrebbe tagliato la scena
- la commessa de `il_tradimento` porta le tre battute riscritte, con
  detto per iscritto cosa tenere del primo tentativo (il pugno che
  incombe, i tre diamanti gialli, le schegge che si staccano)

Co-Authored-By: Claude Opus 5 <noreply@anthropic.com>
</commit_message>
<xml_diff>
--- a/VOLT_Bibbia.docx
+++ b/VOLT_Bibbia.docx
@@ -10025,7 +10025,106 @@
         <w:pStyle w:val="ListBullet"/>
       </w:pPr>
       <w:r>
-        <w:t xml:space="preserve">Oltre il 27 il gioco </w:t>
+        <w:rPr>
+          <w:b/>
+        </w:rPr>
+        <w:t>Settori 28 e 29: le ultime due tappe dell'inseguimento</w:t>
+      </w:r>
+      <w:r>
+        <w:t>, con le stesse</w:t>
+      </w:r>
+      <w:r>
+        <w:t xml:space="preserve"> apparizioni del 25 e del 26.</w:t>
+      </w:r>
+    </w:p>
+    <w:p>
+      <w:pPr>
+        <w:pStyle w:val="ListBullet"/>
+      </w:pPr>
+      <w:r>
+        <w:rPr>
+          <w:b/>
+        </w:rPr>
+        <w:t>Settore 30: il terzo scontro, e la caccia finisce.</w:t>
+      </w:r>
+      <w:r>
+        <w:t xml:space="preserve"> ECHO-0 arriva alla</w:t>
+      </w:r>
+      <w:r>
+        <w:t xml:space="preserve"> terza mano — quasi il triplo della vita del primo incontro — e stavolta la</w:t>
+      </w:r>
+      <w:r>
+        <w:t xml:space="preserve"> fuga non gli riesce: il banner dice </w:t>
+      </w:r>
+      <w:r>
+        <w:rPr>
+          <w:b/>
+        </w:rPr>
+        <w:t>«STAVOLTA NO»</w:t>
+      </w:r>
+      <w:r>
+        <w:t>, il potere non te lo</w:t>
+      </w:r>
+      <w:r>
+        <w:t xml:space="preserve"> restituisce ma </w:t>
+      </w:r>
+      <w:r>
+        <w:rPr>
+          <w:b/>
+        </w:rPr>
+        <w:t>glielo riprendi</w:t>
+      </w:r>
+      <w:r>
+        <w:t>, e al posto del solito lampo viola c'è un</w:t>
+      </w:r>
+      <w:r>
+        <w:t xml:space="preserve"> lampo verde con la scritta </w:t>
+      </w:r>
+      <w:r>
+        <w:rPr>
+          <w:b/>
+        </w:rPr>
+        <w:t>«AMPERE È TORNATA»</w:t>
+      </w:r>
+      <w:r>
+        <w:t>.</w:t>
+      </w:r>
+    </w:p>
+    <w:p>
+      <w:pPr>
+        <w:pStyle w:val="ListBullet"/>
+      </w:pPr>
+      <w:r>
+        <w:rPr>
+          <w:b/>
+        </w:rPr>
+        <w:t>E subito dopo parte `ampere_torna`</w:t>
+      </w:r>
+      <w:r>
+        <w:t>, il filmato dello strappo. Il tratto</w:t>
+      </w:r>
+      <w:r>
+        <w:t xml:space="preserve"> giocabile si chiude </w:t>
+      </w:r>
+      <w:r>
+        <w:rPr>
+          <w:b/>
+        </w:rPr>
+        <w:t>dopo</w:t>
+      </w:r>
+      <w:r>
+        <w:t xml:space="preserve"> il filmato, non prima: la caccia non si ferma un</w:t>
+      </w:r>
+      <w:r>
+        <w:t xml:space="preserve"> attimo prima del momento per cui l'hai fatta.</w:t>
+      </w:r>
+    </w:p>
+    <w:p>
+      <w:pPr>
+        <w:pStyle w:val="ListBullet"/>
+      </w:pPr>
+      <w:r>
+        <w:t xml:space="preserve">Oltre il 30 il gioco </w:t>
       </w:r>
       <w:r>
         <w:rPr>
@@ -10037,7 +10136,10 @@
         <w:t>, invece di far finta: schermata</w:t>
       </w:r>
       <w:r>
-        <w:t xml:space="preserve"> «fine di questo tratto». Il confine si sposta man mano che costruiamo.</w:t>
+        <w:t xml:space="preserve"> «fine di questo tratto», e la frase dice che adesso la caccia si rovescia. Il</w:t>
+      </w:r>
+      <w:r>
+        <w:t xml:space="preserve"> confine si sposta man mano che costruiamo.</w:t>
       </w:r>
     </w:p>
     <w:p>
@@ -10054,10 +10156,10 @@
         <w:rPr>
           <w:b/>
         </w:rPr>
-        <w:t>28-65</w:t>
-      </w:r>
-      <w:r>
-        <w:t>: il terzo scontro e lo strappo della lanterna, la caccia al contrario dei settori 31-35, il tradimento di ECHO-1, Eclissia, la barra della corrente addosso, i Silenti, il reattore, la salita in 2,5D, la cima in soggettiva, OHM, Ampere rovesciata e i filmati che restano.</w:t>
+        <w:t>31-65</w:t>
+      </w:r>
+      <w:r>
+        <w:t>: la caccia al contrario dei settori 31-35, il tradimento di ECHO-1, Eclissia, la barra della corrente addosso, i Silenti, il reattore, la salita in 2,5D, la cima in soggettiva, OHM, Ampere rovesciata e i filmati che restano.</w:t>
       </w:r>
     </w:p>
     <w:p>

</xml_diff>

<commit_message>
v65 — i banner diventano fumetto
Tre forme, e la differenza non e' estetica: in una vignetta chi parla ha
la nuvoletta e chi racconta ha la targa.

- NUVOLETTA (nera, bordo viola, codina): solo quello che una creatura
  dice davvero. La codina punta da che parte sta chi parla — centrata,
  la battuta sembrava dell'eroe
- TARGA (gialla, storta, bordo spesso): il gioco che racconta —
  missioni, leggi, portale, ondate
- LETTERING GROSSO col contorno: i nomi propri di chi entra in scena
- la battuta d'ingresso di ECHO-0 passa da scritta volante a nuvoletta,
  e arriva dopo l'avviso della missione invece che sotto
- l'obiettivo dell'HUD nello scontro con ECHO-0 era lungo tre righe e
  finiva sopra la sua barra della vita: adesso e' corto

Co-Authored-By: Claude Opus 5 <noreply@anthropic.com>
</commit_message>
<xml_diff>
--- a/VOLT_Bibbia.docx
+++ b/VOLT_Bibbia.docx
@@ -10018,6 +10018,88 @@
       </w:r>
       <w:r>
         <w:t xml:space="preserve"> audio, quindi su questo filmato la musica del gioco non si ferma.</w:t>
+      </w:r>
+    </w:p>
+    <w:p>
+      <w:pPr>
+        <w:pStyle w:val="ListBullet"/>
+      </w:pPr>
+      <w:r>
+        <w:t>**I banner sono disegnati come in un fumetto, e le forme vogliono dire</w:t>
+      </w:r>
+      <w:r>
+        <w:t xml:space="preserve"> qualcosa.** In una vignetta chi parla ha la nuvoletta e chi racconta ha la</w:t>
+      </w:r>
+      <w:r>
+        <w:t xml:space="preserve"> targa: qui vale uguale.</w:t>
+      </w:r>
+      <w:r>
+        <w:t xml:space="preserve"> - </w:t>
+      </w:r>
+      <w:r>
+        <w:rPr>
+          <w:b/>
+        </w:rPr>
+        <w:t>La nuvoletta</w:t>
+      </w:r>
+      <w:r>
+        <w:t xml:space="preserve"> — nera col bordo viola, gli stessi colori di ECHO-0 — è</w:t>
+      </w:r>
+      <w:r>
+        <w:t xml:space="preserve"> </w:t>
+      </w:r>
+      <w:r>
+        <w:rPr>
+          <w:b/>
+        </w:rPr>
+        <w:t>solo</w:t>
+      </w:r>
+      <w:r>
+        <w:t xml:space="preserve"> quello che una creatura dice davvero: «HO OSSERVATO OGNI TUA</w:t>
+      </w:r>
+      <w:r>
+        <w:t xml:space="preserve"> SCELTA», «CI VEDIAMO PIÙ AVANTI», «STAVOLTA NO». **La codina punta da che</w:t>
+      </w:r>
+      <w:r>
+        <w:t xml:space="preserve"> parte sta chi parla**, se no la battuta sembra dell'eroe.</w:t>
+      </w:r>
+      <w:r>
+        <w:t xml:space="preserve"> - </w:t>
+      </w:r>
+      <w:r>
+        <w:rPr>
+          <w:b/>
+        </w:rPr>
+        <w:t>La targa gialla storta</w:t>
+      </w:r>
+      <w:r>
+        <w:t xml:space="preserve"> è il gioco che racconta: «CACCIA», «PORTALE</w:t>
+      </w:r>
+      <w:r>
+        <w:t xml:space="preserve"> APERTO!», «ONDATA 2», gli avvisi delle missioni e delle leggi.</w:t>
+      </w:r>
+      <w:r>
+        <w:t xml:space="preserve"> - </w:t>
+      </w:r>
+      <w:r>
+        <w:rPr>
+          <w:b/>
+        </w:rPr>
+        <w:t>Il lettering grosso col contorno</w:t>
+      </w:r>
+      <w:r>
+        <w:t xml:space="preserve"> è per i nomi propri di chi entra in</w:t>
+      </w:r>
+      <w:r>
+        <w:t xml:space="preserve"> scena, e per quelli soltanto: «IL DIVORATORE», «ECHO-0», «IL COMANDANTE</w:t>
+      </w:r>
+      <w:r>
+        <w:t xml:space="preserve"> DELLA LAGUNA».</w:t>
+      </w:r>
+    </w:p>
+    <w:p>
+      <w:r>
+        <w:t>Non si mescolano mai, ed è una regola di racconto prima che di grafica: se il gioco parlasse con la nuvoletta, la voce delle creature non varrebbe più niente.</w:t>
       </w:r>
     </w:p>
     <w:p>

</xml_diff>

<commit_message>
v71 — gli squarci di fumetto sui due furti del settore 15
Sui due momenti si aprono due vignette di dettaglio, con la cornice
chiara, come i riquadri di primo piano in una pagina disegnata. Restano
aperte insieme un istante e sembrano due riquadri della stessa pagina.

- la prima: la lanterna, e tre dita nere che si chiudono su di lei
- la seconda: il rapito che grida, con la nuvoletta BIANCA e dentro il
  nome di chi sta giocando — «AREN!» o «LYRA!». Bianca e non nera col
  bordo viola: quella e' la voce delle creature, questa e' di un Custode
- mentre una vignetta e' aperta i banner tacciono: stavano alla stessa
  altezza e due cose insieme non se ne leggeva nessuna

Funziona gia' cosi', disegnato in codice. Se arriva l'immagine vera in
assets/fumetti/ prende il suo posto da sola, senza toccare niente: la
commessa per l'altra IA e' in assets/fumetti/DA-FARE.md

Co-Authored-By: Claude Opus 5 <noreply@anthropic.com>
</commit_message>
<xml_diff>
--- a/VOLT_Bibbia.docx
+++ b/VOLT_Bibbia.docx
@@ -5878,7 +5878,66 @@
         <w:rPr>
           <w:b/>
         </w:rPr>
-        <w:t>Nessuna scritta, nessun filmato.</w:t>
+        <w:t>E su ciascuno dei due furti si apre uno squarcio di fumetto.</w:t>
+      </w:r>
+      <w:r>
+        <w:t xml:space="preserve"> Una vignetta piccola, in alto, con la cornice chiara: ingrandisce il momento come il riquadro di primo piano in una pagina disegnata. Restano aperte insieme un istante, in fila, e sembrano due riquadri della stessa pagina.</w:t>
+      </w:r>
+    </w:p>
+    <w:p>
+      <w:pPr>
+        <w:pStyle w:val="ListBullet"/>
+      </w:pPr>
+      <w:r>
+        <w:rPr>
+          <w:b/>
+        </w:rPr>
+        <w:t>La prima</w:t>
+      </w:r>
+      <w:r>
+        <w:t xml:space="preserve"> è la lanterna, con tre dita nere che si chiudono su di lei.</w:t>
+      </w:r>
+    </w:p>
+    <w:p>
+      <w:pPr>
+        <w:pStyle w:val="ListBullet"/>
+      </w:pPr>
+      <w:r>
+        <w:rPr>
+          <w:b/>
+        </w:rPr>
+        <w:t>La seconda</w:t>
+      </w:r>
+      <w:r>
+        <w:t xml:space="preserve"> è il rapito che grida, e nella nuvoletta bianca c'è **il nome</w:t>
+      </w:r>
+      <w:r>
+        <w:t xml:space="preserve"> di chi sta giocando**: «AREN!» se giochi Aren, «LYRA!» se giochi Lyra. Chiama</w:t>
+      </w:r>
+      <w:r>
+        <w:t xml:space="preserve"> la persona che lo sta cercando.</w:t>
+      </w:r>
+    </w:p>
+    <w:p>
+      <w:r>
+        <w:t xml:space="preserve">La nuvoletta è </w:t>
+      </w:r>
+      <w:r>
+        <w:rPr>
+          <w:b/>
+        </w:rPr>
+        <w:t>bianca col testo scuro</w:t>
+      </w:r>
+      <w:r>
+        <w:t>, non nera col bordo viola: quella è la voce delle creature della Frattura, questa è la voce di un Custode, e la differenza si deve vedere dal colore prima ancora che dalle parole.</w:t>
+      </w:r>
+    </w:p>
+    <w:p>
+      <w:r>
+        <w:rPr>
+          <w:b/>
+        </w:rPr>
+        <w:t>Nessun'altra scritta, nessun filmato.</w:t>
       </w:r>
       <w:r>
         <w:t xml:space="preserve"> Vale la regola di tutta la semina: chi guarda lo vede.</w:t>

</xml_diff>

<commit_message>
v72 — il_tradimento nel gioco, e il grido chiede aiuto
- «AIUTO AREN!» / «AIUTO LYRA!» nella vignetta del settore 15: il
  rapito chiama la persona che lo sta cercando, e quella e' chi ha il
  telefono in mano
- il_tradimento compresso da 31 MB a 2,9 MB, audio portato da -13,1 a
  -23,6 dB come tutti gli altri, con la dissolvenza in coda
- un settore puo' ora avere PIU' filmati di fila (playCinemaSerie): le
  scene spezzate in due si vedono senza stacco. Serve al 35, al 56 e al
  65. Il settore 36 e' gia' predisposto: quando arriva `il_passaggio`
  basta aggiungerlo alla lista
- conteggi allineati: fatti nove, da fare otto (sei essenziali)

Co-Authored-By: Claude Opus 5 <noreply@anthropic.com>
</commit_message>
<xml_diff>
--- a/VOLT_Bibbia.docx
+++ b/VOLT_Bibbia.docx
@@ -5912,10 +5912,22 @@
         <w:t xml:space="preserve"> è il rapito che grida, e nella nuvoletta bianca c'è **il nome</w:t>
       </w:r>
       <w:r>
-        <w:t xml:space="preserve"> di chi sta giocando**: «AREN!» se giochi Aren, «LYRA!» se giochi Lyra. Chiama</w:t>
-      </w:r>
-      <w:r>
-        <w:t xml:space="preserve"> la persona che lo sta cercando.</w:t>
+        <w:t xml:space="preserve"> di chi sta giocando**: «AIUTO AREN!» se giochi Aren, «AIUTO LYRA!» se giochi</w:t>
+      </w:r>
+      <w:r>
+        <w:t xml:space="preserve"> Lyra. Non dice il proprio nome: chiama </w:t>
+      </w:r>
+      <w:r>
+        <w:rPr>
+          <w:b/>
+        </w:rPr>
+        <w:t>la persona che lo sta cercando</w:t>
+      </w:r>
+      <w:r>
+        <w:t>, ed</w:t>
+      </w:r>
+      <w:r>
+        <w:t xml:space="preserve"> è quella che ha il telefono in mano.</w:t>
       </w:r>
     </w:p>
     <w:p>
@@ -12177,7 +12189,7 @@
         <w:t>Fatti</w:t>
       </w:r>
       <w:r>
-        <w:t xml:space="preserve"> (già dentro il gioco, otto):</w:t>
+        <w:t xml:space="preserve"> (già dentro il gioco, nove):</w:t>
       </w:r>
     </w:p>
     <w:tbl>
@@ -12809,6 +12821,86 @@
           </w:p>
         </w:tc>
       </w:tr>
+      <w:tr>
+        <w:tc>
+          <w:tcPr>
+            <w:tcW w:type="dxa" w:w="3173"/>
+          </w:tcPr>
+          <w:p>
+            <w:pPr>
+              <w:spacing w:after="40"/>
+            </w:pPr>
+            <w:r>
+              <w:rPr>
+                <w:sz w:val="20"/>
+              </w:rPr>
+            </w:r>
+            <w:r>
+              <w:rPr>
+                <w:rFonts w:ascii="Consolas" w:hAnsi="Consolas"/>
+                <w:color w:val="7A3FD6"/>
+                <w:sz w:val="20"/>
+              </w:rPr>
+              <w:t>il_tradimento</w:t>
+            </w:r>
+          </w:p>
+        </w:tc>
+        <w:tc>
+          <w:tcPr>
+            <w:tcW w:type="dxa" w:w="3173"/>
+          </w:tcPr>
+          <w:p>
+            <w:pPr>
+              <w:spacing w:after="40"/>
+            </w:pPr>
+            <w:r>
+              <w:rPr>
+                <w:sz w:val="20"/>
+              </w:rPr>
+            </w:r>
+            <w:r>
+              <w:rPr>
+                <w:sz w:val="20"/>
+              </w:rPr>
+              <w:t>fine del settore 35</w:t>
+            </w:r>
+          </w:p>
+        </w:tc>
+        <w:tc>
+          <w:tcPr>
+            <w:tcW w:type="dxa" w:w="3173"/>
+          </w:tcPr>
+          <w:p>
+            <w:pPr>
+              <w:spacing w:after="40"/>
+            </w:pPr>
+            <w:r>
+              <w:rPr>
+                <w:sz w:val="20"/>
+              </w:rPr>
+            </w:r>
+            <w:r>
+              <w:rPr>
+                <w:sz w:val="20"/>
+              </w:rPr>
+              <w:t xml:space="preserve">ECHO-0 in ginocchio allunga la mano verso la lanterna che è in mano ai Custodi; il pugno di ECHO-1 la strappa </w:t>
+            </w:r>
+            <w:r>
+              <w:rPr>
+                <w:b/>
+                <w:sz w:val="20"/>
+              </w:rPr>
+              <w:t>a loro</w:t>
+            </w:r>
+            <w:r>
+              <w:rPr>
+                <w:sz w:val="20"/>
+              </w:rPr>
+              <w:t>; restano tutti e tre a terra con la mano tesa nel vuoto</w:t>
+            </w:r>
+          </w:p>
+        </w:tc>
+      </w:tr>
     </w:tbl>
     <w:p/>
     <w:p>
@@ -12816,10 +12908,10 @@
         <w:rPr>
           <w:b/>
         </w:rPr>
-        <w:t>Da fare: nove</w:t>
-      </w:r>
-      <w:r>
-        <w:t xml:space="preserve">, qui in ordine di settore. I sette segnati </w:t>
+        <w:t>Da fare: otto</w:t>
+      </w:r>
+      <w:r>
+        <w:t xml:space="preserve">, qui in ordine di settore. I sei segnati </w:t>
       </w:r>
       <w:r>
         <w:rPr>
@@ -13099,7 +13191,7 @@
                 <w:color w:val="7A3FD6"/>
                 <w:sz w:val="20"/>
               </w:rPr>
-              <w:t>il_tradimento</w:t>
+              <w:t>il_passaggio</w:t>
             </w:r>
           </w:p>
         </w:tc>
@@ -13143,20 +13235,7 @@
               <w:rPr>
                 <w:sz w:val="20"/>
               </w:rPr>
-              <w:t xml:space="preserve">ECHO-0 è in ginocchio e allunga la mano verso la lanterna; ECHO-1 la strappa </w:t>
-            </w:r>
-            <w:r>
-              <w:rPr>
-                <w:b/>
-                <w:sz w:val="20"/>
-              </w:rPr>
-              <w:t>ai Custodi</w:t>
-            </w:r>
-            <w:r>
-              <w:rPr>
-                <w:sz w:val="20"/>
-              </w:rPr>
-              <w:t xml:space="preserve"> e sparisce; restano tutti e tre senza</w:t>
+              <w:t>Si rialza e apre la fenditura su Eclissia: «È DI LÀ»</w:t>
             </w:r>
           </w:p>
         </w:tc>
@@ -13225,7 +13304,7 @@
                 <w:color w:val="7A3FD6"/>
                 <w:sz w:val="20"/>
               </w:rPr>
-              <w:t>il_passaggio</w:t>
+              <w:t>eclissia</w:t>
             </w:r>
           </w:p>
         </w:tc>
@@ -13246,7 +13325,7 @@
               <w:rPr>
                 <w:sz w:val="20"/>
               </w:rPr>
-              <w:t>35</w:t>
+              <w:t>36</w:t>
             </w:r>
           </w:p>
         </w:tc>
@@ -13267,7 +13346,7 @@
               <w:rPr>
                 <w:sz w:val="20"/>
               </w:rPr>
-              <w:t>Si rialza e apre la fenditura su Eclissia: «È DI LÀ»</w:t>
+              <w:t>La prima immagine del mondo nuovo, con la Caldera all'orizzonte</w:t>
             </w:r>
           </w:p>
         </w:tc>
@@ -13286,10 +13365,9 @@
             </w:r>
             <w:r>
               <w:rPr>
-                <w:b/>
-                <w:sz w:val="20"/>
-              </w:rPr>
-              <w:t>essenziale</w:t>
+                <w:sz w:val="20"/>
+              </w:rPr>
+              <w:t>desiderabile</w:t>
             </w:r>
           </w:p>
         </w:tc>
@@ -13337,7 +13415,7 @@
                 <w:color w:val="7A3FD6"/>
                 <w:sz w:val="20"/>
               </w:rPr>
-              <w:t>eclissia</w:t>
+              <w:t>il_reattore</w:t>
             </w:r>
           </w:p>
         </w:tc>
@@ -13359,7 +13437,7 @@
               <w:rPr>
                 <w:sz w:val="20"/>
               </w:rPr>
-              <w:t>36</w:t>
+              <w:t>56</w:t>
             </w:r>
           </w:p>
         </w:tc>
@@ -13381,7 +13459,7 @@
               <w:rPr>
                 <w:sz w:val="20"/>
               </w:rPr>
-              <w:t>La prima immagine del mondo nuovo, con la Caldera all'orizzonte</w:t>
+              <w:t>I tre cristalli si spengono, Ampere esce e si riempie di colpo</w:t>
             </w:r>
           </w:p>
         </w:tc>
@@ -13401,9 +13479,10 @@
             </w:r>
             <w:r>
               <w:rPr>
-                <w:sz w:val="20"/>
-              </w:rPr>
-              <w:t>desiderabile</w:t>
+                <w:b/>
+                <w:sz w:val="20"/>
+              </w:rPr>
+              <w:t>essenziale</w:t>
             </w:r>
           </w:p>
         </w:tc>
@@ -13449,7 +13528,7 @@
                 <w:color w:val="7A3FD6"/>
                 <w:sz w:val="20"/>
               </w:rPr>
-              <w:t>il_reattore</w:t>
+              <w:t>la_scelta_di_echo</w:t>
             </w:r>
           </w:p>
         </w:tc>
@@ -13491,7 +13570,7 @@
               <w:rPr>
                 <w:sz w:val="20"/>
               </w:rPr>
-              <w:t>I tre cristalli si spengono, Ampere esce e si riempie di colpo</w:t>
+              <w:t>ECHO-0 allunga la mano verso la lanterna e la ritira</w:t>
             </w:r>
           </w:p>
         </w:tc>
@@ -13561,7 +13640,7 @@
                 <w:color w:val="7A3FD6"/>
                 <w:sz w:val="20"/>
               </w:rPr>
-              <w:t>la_scelta_di_echo</w:t>
+              <w:t>la_cima</w:t>
             </w:r>
           </w:p>
         </w:tc>
@@ -13583,7 +13662,7 @@
               <w:rPr>
                 <w:sz w:val="20"/>
               </w:rPr>
-              <w:t>56</w:t>
+              <w:t>65</w:t>
             </w:r>
           </w:p>
         </w:tc>
@@ -13605,7 +13684,7 @@
               <w:rPr>
                 <w:sz w:val="20"/>
               </w:rPr>
-              <w:t>ECHO-0 allunga la mano verso la lanterna e la ritira</w:t>
+              <w:t>OHM si condensa sopra il cratere; il segno Ω si accende</w:t>
             </w:r>
           </w:p>
         </w:tc>
@@ -13674,7 +13753,7 @@
                 <w:color w:val="7A3FD6"/>
                 <w:sz w:val="20"/>
               </w:rPr>
-              <w:t>la_cima</w:t>
+              <w:t>il_finale</w:t>
             </w:r>
           </w:p>
         </w:tc>
@@ -13716,7 +13795,7 @@
               <w:rPr>
                 <w:sz w:val="20"/>
               </w:rPr>
-              <w:t>OHM si condensa sopra il cratere; il segno Ω si accende</w:t>
+              <w:t>L'eruzione, il cielo che si cuce, la scintilla che entra in Ampere, Eclio</w:t>
             </w:r>
           </w:p>
         </w:tc>
@@ -13786,7 +13865,7 @@
                 <w:color w:val="7A3FD6"/>
                 <w:sz w:val="20"/>
               </w:rPr>
-              <w:t>il_finale</w:t>
+              <w:t>il_bacio</w:t>
             </w:r>
           </w:p>
         </w:tc>
@@ -13830,7 +13909,7 @@
               <w:rPr>
                 <w:sz w:val="20"/>
               </w:rPr>
-              <w:t>L'eruzione, il cielo che si cuce, la scintilla che entra in Ampere, Eclio</w:t>
+              <w:t>Aren si toglie il casco, lo lascia cadere, abbraccia e bacia Lyra</w:t>
             </w:r>
           </w:p>
         </w:tc>
@@ -13858,121 +13937,11 @@
           </w:p>
         </w:tc>
       </w:tr>
-      <w:tr>
-        <w:tc>
-          <w:tcPr>
-            <w:tcW w:type="dxa" w:w="1904"/>
-          </w:tcPr>
-          <w:p>
-            <w:pPr>
-              <w:spacing w:after="40"/>
-            </w:pPr>
-            <w:r>
-              <w:rPr>
-                <w:sz w:val="20"/>
-              </w:rPr>
-            </w:r>
-            <w:r>
-              <w:rPr>
-                <w:sz w:val="20"/>
-              </w:rPr>
-              <w:t>9</w:t>
-            </w:r>
-          </w:p>
-        </w:tc>
-        <w:tc>
-          <w:tcPr>
-            <w:tcW w:type="dxa" w:w="1904"/>
-          </w:tcPr>
-          <w:p>
-            <w:pPr>
-              <w:spacing w:after="40"/>
-            </w:pPr>
-            <w:r>
-              <w:rPr>
-                <w:sz w:val="20"/>
-              </w:rPr>
-            </w:r>
-            <w:r>
-              <w:rPr>
-                <w:rFonts w:ascii="Consolas" w:hAnsi="Consolas"/>
-                <w:color w:val="7A3FD6"/>
-                <w:sz w:val="20"/>
-              </w:rPr>
-              <w:t>il_bacio</w:t>
-            </w:r>
-          </w:p>
-        </w:tc>
-        <w:tc>
-          <w:tcPr>
-            <w:tcW w:type="dxa" w:w="1904"/>
-          </w:tcPr>
-          <w:p>
-            <w:pPr>
-              <w:spacing w:after="40"/>
-            </w:pPr>
-            <w:r>
-              <w:rPr>
-                <w:sz w:val="20"/>
-              </w:rPr>
-            </w:r>
-            <w:r>
-              <w:rPr>
-                <w:sz w:val="20"/>
-              </w:rPr>
-              <w:t>65</w:t>
-            </w:r>
-          </w:p>
-        </w:tc>
-        <w:tc>
-          <w:tcPr>
-            <w:tcW w:type="dxa" w:w="1904"/>
-          </w:tcPr>
-          <w:p>
-            <w:pPr>
-              <w:spacing w:after="40"/>
-            </w:pPr>
-            <w:r>
-              <w:rPr>
-                <w:sz w:val="20"/>
-              </w:rPr>
-            </w:r>
-            <w:r>
-              <w:rPr>
-                <w:sz w:val="20"/>
-              </w:rPr>
-              <w:t>Aren si toglie il casco, lo lascia cadere, abbraccia e bacia Lyra</w:t>
-            </w:r>
-          </w:p>
-        </w:tc>
-        <w:tc>
-          <w:tcPr>
-            <w:tcW w:type="dxa" w:w="1904"/>
-          </w:tcPr>
-          <w:p>
-            <w:pPr>
-              <w:spacing w:after="40"/>
-            </w:pPr>
-            <w:r>
-              <w:rPr>
-                <w:sz w:val="20"/>
-              </w:rPr>
-            </w:r>
-            <w:r>
-              <w:rPr>
-                <w:b/>
-                <w:sz w:val="20"/>
-              </w:rPr>
-              <w:t>essenziale</w:t>
-            </w:r>
-          </w:p>
-        </w:tc>
-      </w:tr>
     </w:tbl>
     <w:p/>
     <w:p>
       <w:r>
-        <w:t xml:space="preserve">I sette essenziali vanno prodotti </w:t>
+        <w:t xml:space="preserve">I sei essenziali vanno prodotti </w:t>
       </w:r>
       <w:r>
         <w:rPr>
@@ -13989,7 +13958,7 @@
           <w:color w:val="7A3FD6"/>
           <w:sz w:val="19"/>
         </w:rPr>
-        <w:t>il_tradimento</w:t>
+        <w:t>il_reattore</w:t>
       </w:r>
       <w:r>
         <w:t>+</w:t>
@@ -14000,10 +13969,10 @@
           <w:color w:val="7A3FD6"/>
           <w:sz w:val="19"/>
         </w:rPr>
-        <w:t>il_passaggio</w:t>
-      </w:r>
-      <w:r>
-        <w:t xml:space="preserve">, </w:t>
+        <w:t>la_scelta_di_echo</w:t>
+      </w:r>
+      <w:r>
+        <w:t xml:space="preserve">, e </w:t>
       </w:r>
       <w:r>
         <w:rPr>
@@ -14011,7 +13980,7 @@
           <w:color w:val="7A3FD6"/>
           <w:sz w:val="19"/>
         </w:rPr>
-        <w:t>il_reattore</w:t>
+        <w:t>la_cima</w:t>
       </w:r>
       <w:r>
         <w:t>+</w:t>
@@ -14022,10 +13991,10 @@
           <w:color w:val="7A3FD6"/>
           <w:sz w:val="19"/>
         </w:rPr>
-        <w:t>la_scelta_di_echo</w:t>
-      </w:r>
-      <w:r>
-        <w:t xml:space="preserve">, e </w:t>
+        <w:t>il_finale</w:t>
+      </w:r>
+      <w:r>
+        <w:t>+</w:t>
       </w:r>
       <w:r>
         <w:rPr>
@@ -14033,32 +14002,19 @@
           <w:color w:val="7A3FD6"/>
           <w:sz w:val="19"/>
         </w:rPr>
-        <w:t>la_cima</w:t>
-      </w:r>
-      <w:r>
-        <w:t>+</w:t>
-      </w:r>
-      <w:r>
-        <w:rPr>
-          <w:rFonts w:ascii="Consolas" w:hAnsi="Consolas"/>
-          <w:color w:val="7A3FD6"/>
-          <w:sz w:val="19"/>
-        </w:rPr>
-        <w:t>il_finale</w:t>
-      </w:r>
-      <w:r>
-        <w:t>+</w:t>
-      </w:r>
-      <w:r>
-        <w:rPr>
-          <w:rFonts w:ascii="Consolas" w:hAnsi="Consolas"/>
-          <w:color w:val="7A3FD6"/>
-          <w:sz w:val="19"/>
-        </w:rPr>
         <w:t>il_bacio</w:t>
       </w:r>
       <w:r>
-        <w:t>, che sono una sequenza sola.</w:t>
+        <w:t xml:space="preserve">, che sono una sequenza sola. </w:t>
+      </w:r>
+      <w:r>
+        <w:rPr>
+          <w:b/>
+        </w:rPr>
+        <w:t>`il_passaggio` è il seguito immediato di `il_tradimento`</w:t>
+      </w:r>
+      <w:r>
+        <w:t>, che è già girato: attacca esattamente dove quello finisce.</w:t>
       </w:r>
     </w:p>
     <w:p>

</xml_diff>

<commit_message>
v75 — ampere_torna: 32 MB andati online, corretto
Il filmato era stato riconsegnato CON l'audio (bene: risolveva il
silenzio) ma in versione originale non compressa, ed e' finito online
cosi': 32 MB per otto secondi, su un telefono in 4G improponibile.

- ricompresso a 2,5 MB, due passate, faststart
- audio da -13,3 a -23,6 dB come tutti gli altri, con la dissolvenza
- originale con audio salvato in orig/ampere_torna_con_audio.mp4
- FILMATI_MUTI ora e' vuoto: la musica del gioco torna a fermarsi
  durante il filmato, che e' il comportamento giusto quando l'audio c'e'

Da controllare sempre, prima di committare un filmato: il peso.

Co-Authored-By: Claude Opus 5 <noreply@anthropic.com>
</commit_message>
<xml_diff>
--- a/VOLT_Bibbia.docx
+++ b/VOLT_Bibbia.docx
@@ -10294,10 +10294,7 @@
         <w:t xml:space="preserve"> si vede entrando nel settore 31: è lo strappo</w:t>
       </w:r>
       <w:r>
-        <w:t xml:space="preserve"> della lanterna, cioè come finisce lo scontro del 30. È arrivato senza traccia</w:t>
-      </w:r>
-      <w:r>
-        <w:t xml:space="preserve"> audio, quindi su questo filmato la musica del gioco non si ferma.</w:t>
+        <w:t xml:space="preserve"> della lanterna, cioè come finisce lo scontro del 30.</w:t>
       </w:r>
     </w:p>
     <w:p>
@@ -12809,14 +12806,7 @@
               <w:rPr>
                 <w:sz w:val="20"/>
               </w:rPr>
-              <w:t xml:space="preserve">Lo strappo: la lanterna passa di mano, si accende di verde fra Aren e Lyra, ECHO-0 indietreggia e fugge nel varco. </w:t>
-            </w:r>
-            <w:r>
-              <w:rPr>
-                <w:b/>
-                <w:sz w:val="20"/>
-              </w:rPr>
-              <w:t>È muto</w:t>
+              <w:t>Lo strappo: la lanterna passa di mano, si accende di verde fra Aren e Lyra, ECHO-0 indietreggia e fugge nel varco</w:t>
             </w:r>
           </w:p>
         </w:tc>

</xml_diff>

<commit_message>
il_passaggio passa a quattro battute: IL PREZZO
Mancava il momento in cui il giocatore capisce QUANTO costa a ECHO-0
indicare quella strada. Adesso c'e', e senza una parola: dalla fenditura
arriva un filo della luce verde di Ampere, gli tocca il petto, e alcune
schegge del suo corpo diventano trasparenti.

Tre regole strette sulla battuta nuova, scritte in commessa:
- non e' una scoperta, e' una conferma: rassegnazione, non stupore
- la scintilla pulsa una volta sola e NON e' il soggetto, se no al 65 la
  rivelazione e' gia' bruciata
- le schegge tornano solide: ha visto cosa succedera', non sta morendo

E' la battuta che regge la scena del 56: senza, la mano che si ritira e'
un gesto gentile; con, il giocatore sa che prendersi Ampere era l'unico
modo che aveva di restare vivo.

Co-Authored-By: Claude Opus 5 <noreply@anthropic.com>
</commit_message>
<xml_diff>
--- a/VOLT_Bibbia.docx
+++ b/VOLT_Bibbia.docx
@@ -2620,6 +2620,123 @@
           <w:b/>
         </w:rPr>
         <w:t>Ve la indica lo stesso.</w:t>
+      </w:r>
+    </w:p>
+    <w:p>
+      <w:pPr>
+        <w:pStyle w:val="Heading3"/>
+      </w:pPr>
+      <w:r>
+        <w:t>Il prezzo (settore 35) [SCRITTO]</w:t>
+      </w:r>
+    </w:p>
+    <w:p>
+      <w:r>
+        <w:t xml:space="preserve">E il giocatore lo vede, in una battuta sola del filmato </w:t>
+      </w:r>
+      <w:r>
+        <w:rPr>
+          <w:rFonts w:ascii="Consolas" w:hAnsi="Consolas"/>
+          <w:color w:val="7A3FD6"/>
+          <w:sz w:val="19"/>
+        </w:rPr>
+        <w:t>il_passaggio</w:t>
+      </w:r>
+      <w:r>
+        <w:t>.</w:t>
+      </w:r>
+    </w:p>
+    <w:p>
+      <w:r>
+        <w:t xml:space="preserve">Appena la fenditura si apre, </w:t>
+      </w:r>
+      <w:r>
+        <w:rPr>
+          <w:b/>
+        </w:rPr>
+        <w:t>dalla parte di là arriva un filo di luce verde</w:t>
+      </w:r>
+      <w:r>
+        <w:t xml:space="preserve"> — è Ampere, lontanissima, nel petto di ECHO-1. Quando quel filo gli tocca il petto, </w:t>
+      </w:r>
+      <w:r>
+        <w:rPr>
+          <w:b/>
+        </w:rPr>
+        <w:t>alcune schegge del suo corpo diventano trasparenti e cominciano a sfaldarsi</w:t>
+      </w:r>
+      <w:r>
+        <w:t>. Poi la luce passa oltre e tornano solide.</w:t>
+      </w:r>
+    </w:p>
+    <w:p>
+      <w:r>
+        <w:t>Non serve altro. La regola del mondo si capisce da sola:</w:t>
+      </w:r>
+    </w:p>
+    <w:p>
+      <w:pPr>
+        <w:spacing w:before="160" w:after="200"/>
+        <w:ind w:left="340"/>
+        <w:pBdr>
+          <w:left w:val="single" w:sz="18" w:space="10" w:color="7A3FD6"/>
+        </w:pBdr>
+      </w:pPr>
+      <w:r>
+        <w:rPr>
+          <w:b/>
+          <w:sz w:val="21"/>
+        </w:rPr>
+        <w:t>ECHO-0 è nato dall'assenza di Ampere. Se Ampere torna viva, lui non può più esistere.</w:t>
+      </w:r>
+    </w:p>
+    <w:p>
+      <w:r>
+        <w:rPr>
+          <w:b/>
+        </w:rPr>
+        <w:t>Non è una scoperta: è una conferma.</w:t>
+      </w:r>
+      <w:r>
+        <w:t xml:space="preserve"> Lo sospettava, e adesso l'ha visto. Per questo la faccia non è stupore ma </w:t>
+      </w:r>
+      <w:r>
+        <w:rPr>
+          <w:b/>
+        </w:rPr>
+        <w:t>rassegnazione</w:t>
+      </w:r>
+      <w:r>
+        <w:t xml:space="preserve">. Abbassa la mano dal petto, guarda i due Custodi, e </w:t>
+      </w:r>
+      <w:r>
+        <w:rPr>
+          <w:b/>
+        </w:rPr>
+        <w:t>indica lo squarcio lo stesso</w:t>
+      </w:r>
+      <w:r>
+        <w:t>.</w:t>
+      </w:r>
+    </w:p>
+    <w:p>
+      <w:r>
+        <w:rPr>
+          <w:b/>
+        </w:rPr>
+        <w:t>Ed è qui che nasce la scena del settore 56.</w:t>
+      </w:r>
+      <w:r>
+        <w:t xml:space="preserve"> Là avrà Ampere a un passo e non la prenderà. Senza questa battuta è un gesto gentile; con questa battuta il giocatore sa che prendersela era </w:t>
+      </w:r>
+      <w:r>
+        <w:rPr>
+          <w:b/>
+        </w:rPr>
+        <w:t>l'unico modo che aveva di restare vivo</w:t>
+      </w:r>
+      <w:r>
+        <w:t>. È per questo che alla fine i due Custodi non lo lasciano andare.</w:t>
       </w:r>
     </w:p>
     <w:p>
@@ -13225,7 +13342,20 @@
               <w:rPr>
                 <w:sz w:val="20"/>
               </w:rPr>
-              <w:t>Si rialza e apre la fenditura su Eclissia: «È DI LÀ»</w:t>
+              <w:t xml:space="preserve">Si rialza, apre la fenditura, </w:t>
+            </w:r>
+            <w:r>
+              <w:rPr>
+                <w:b/>
+                <w:sz w:val="20"/>
+              </w:rPr>
+              <w:t>vede il prezzo</w:t>
+            </w:r>
+            <w:r>
+              <w:rPr>
+                <w:sz w:val="20"/>
+              </w:rPr>
+              <w:t xml:space="preserve"> — la luce verde lo sfalda — e indica lo stesso: «È DI LÀ»</w:t>
             </w:r>
           </w:p>
         </w:tc>

</xml_diff>

<commit_message>
il_passaggio: le tre battute, e la regola del silenzio di ECHO-0
Confermate «E' DI LA'», «PERDONATEMI...», «ERA L'UNICO MODO PER RESTARE
VIVO». Scartata la quarta: dichiarava da che parte sta, e scioglieva
venti settori prima del dovuto la domanda che regge Eclissia.

Scritta in Bibbia come regola generale del personaggio, non come scelta
di una scena: ECHO-0 fa le cose e lascia che si interpretino.

Co-Authored-By: Claude Opus 5 <noreply@anthropic.com>
</commit_message>
<xml_diff>
--- a/VOLT_Bibbia.docx
+++ b/VOLT_Bibbia.docx
@@ -2563,7 +2563,75 @@
         <w:rPr>
           <w:sz w:val="21"/>
         </w:rPr>
-        <w:t>«HO OSSERVATO OGNI TUA SCELTA. ORA I TUOI POTERI APPARTENGONO A ME.» «VOI VOLETE SALVARE IL VOSTRO MONDO. IO STO SOLTANTO CERCANDO DI NON SCOMPARIRE.»</w:t>
+        <w:t xml:space="preserve">«HO OSSERVATO OGNI TUA SCELTA. ORA I TUOI POTERI APPARTENGONO A ME.» «VOI VOLETE SALVARE IL VOSTRO MONDO. IO STO SOLTANTO CERCANDO DI NON SCOMPARIRE.» «QUELLA LUCE NON È VOSTRA.» </w:t>
+      </w:r>
+      <w:r>
+        <w:rPr>
+          <w:i/>
+          <w:sz w:val="21"/>
+        </w:rPr>
+        <w:t>(quando viene a riprendersi Ampere, settori 31-34)</w:t>
+      </w:r>
+      <w:r>
+        <w:rPr>
+          <w:sz w:val="21"/>
+        </w:rPr>
+        <w:t xml:space="preserve"> «TORNERÒ.» </w:t>
+      </w:r>
+      <w:r>
+        <w:rPr>
+          <w:i/>
+          <w:sz w:val="21"/>
+        </w:rPr>
+        <w:t>(quando lo respingi)</w:t>
+      </w:r>
+      <w:r>
+        <w:rPr>
+          <w:sz w:val="21"/>
+        </w:rPr>
+        <w:t xml:space="preserve"> «È DI LÀ. PERDONATEMI… ERA L'UNICO MODO PER RESTARE VIVO.» </w:t>
+      </w:r>
+      <w:r>
+        <w:rPr>
+          <w:i/>
+          <w:sz w:val="21"/>
+        </w:rPr>
+        <w:t>(settore 35)</w:t>
+      </w:r>
+    </w:p>
+    <w:p>
+      <w:pPr>
+        <w:spacing w:before="160" w:after="200"/>
+        <w:ind w:left="340"/>
+        <w:pBdr>
+          <w:left w:val="single" w:sz="18" w:space="10" w:color="7A3FD6"/>
+        </w:pBdr>
+      </w:pPr>
+      <w:r>
+        <w:rPr>
+          <w:b/>
+          <w:sz w:val="21"/>
+        </w:rPr>
+        <w:t>ECHO-0 non spiega mai le proprie ragioni fino in fondo, e non dice mai da che parte sta.</w:t>
+      </w:r>
+      <w:r>
+        <w:rPr>
+          <w:sz w:val="21"/>
+        </w:rPr>
+        <w:t xml:space="preserve"> Fa le cose e lascia che si interpretino. È la regola che tiene in piedi i venti settori di Eclissia, dove la domanda in testa al giocatore deve restare una sola: </w:t>
+      </w:r>
+      <w:r>
+        <w:rPr>
+          <w:i/>
+          <w:sz w:val="21"/>
+        </w:rPr>
+        <w:t>quando mi tradisce?</w:t>
+      </w:r>
+      <w:r>
+        <w:rPr>
+          <w:sz w:val="21"/>
+        </w:rPr>
+        <w:t xml:space="preserve"> Una battuta come «ma è giusto che torni vostra» — proposta e scartata — scioglieva quella domanda venti settori prima del dovuto.</w:t>
       </w:r>
     </w:p>
     <w:p>

</xml_diff>

<commit_message>
v80 — ritmo della caccia: ECHO-0 arriva quando c'e' qualcosa da rubare
Due difetti visti provando davvero:

1. Le cariche erano sparpagliate a caso e finivano ammucchiate in fondo
   al settore: il primo pezzo di strada era vuoto. Adesso ce n'e' una
   per ogni tratto, e sono otto invece di sette.
2. ECHO-0 arrivava a tempo e trovava la lanterna quasi vuota: veniva a
   rubare niente. Adesso arriva quando la carica supera il terzo (mai
   prima di 8 secondi); se non raccogli nulla si presenta comunque dopo
   26, ma il suo momento e' quello in cui hai qualcosa da perdere.

Misurato: lanterna vuota -> arriva a 26,4s. Lanterna al 45% -> arriva a
10,4s con il 45% ancora dentro.

Co-Authored-By: Claude Opus 5 <noreply@anthropic.com>
</commit_message>
<xml_diff>
--- a/VOLT_Bibbia.docx
+++ b/VOLT_Bibbia.docx
@@ -10701,7 +10701,13 @@
         <w:t>, con un filo verde che salta</w:t>
       </w:r>
       <w:r>
-        <w:t xml:space="preserve"> di mostro in mostro. La carica </w:t>
+        <w:t xml:space="preserve"> di mostro in mostro. Le cariche sparse sono **una per ogni tratto del</w:t>
+      </w:r>
+      <w:r>
+        <w:t xml:space="preserve"> settore**, non a caso: sparpagliate a caso finivano ammucchiate in fondo e</w:t>
+      </w:r>
+      <w:r>
+        <w:t xml:space="preserve"> il primo pezzo di strada era vuoto. La carica </w:t>
       </w:r>
       <w:r>
         <w:rPr>
@@ -10725,13 +10731,31 @@
         <w:t>ECHO-0 non ti aspetta alla fine del settore: arriva mentre giochi.</w:t>
       </w:r>
       <w:r>
-        <w:t xml:space="preserve"> Fra i</w:t>
-      </w:r>
-      <w:r>
-        <w:t xml:space="preserve"> nove e i quindici secondi dall'inizio, dal bordo, in alto, dalla parte in</w:t>
-      </w:r>
-      <w:r>
-        <w:t xml:space="preserve"> cui stai andando. Entra col suo nome e con una battuta: **«QUELLA LUCE NON È</w:t>
+        <w:t xml:space="preserve"> E non</w:t>
+      </w:r>
+      <w:r>
+        <w:t xml:space="preserve"> arriva a tempo: </w:t>
+      </w:r>
+      <w:r>
+        <w:rPr>
+          <w:b/>
+        </w:rPr>
+        <w:t>arriva quando nella lanterna c'è qualcosa da prendere</w:t>
+      </w:r>
+      <w:r>
+        <w:t xml:space="preserve"> —</w:t>
+      </w:r>
+      <w:r>
+        <w:t xml:space="preserve"> dal terzo di carica in su, e mai prima di otto secondi. Se non raccogli</w:t>
+      </w:r>
+      <w:r>
+        <w:t xml:space="preserve"> niente si presenta lo stesso dopo ventisei secondi, ma il suo momento è</w:t>
+      </w:r>
+      <w:r>
+        <w:t xml:space="preserve"> quello in cui hai qualcosa da perdere. Entra dal bordo, in alto, dalla parte</w:t>
+      </w:r>
+      <w:r>
+        <w:t xml:space="preserve"> in cui stai andando, col suo nome e con una battuta: **«QUELLA LUCE NON È</w:t>
       </w:r>
       <w:r>
         <w:t xml:space="preserve"> VOSTRA»**.</w:t>

</xml_diff>

<commit_message>
v81 — il_passaggio nel gioco, con i sottotitoli aggiunti
Il filmato e' arrivato con le quattro battute giuste e il parlato, ma
SENZA testo a schermo. Sul telefono il browser blocca l'audio finche'
non si tocca lo schermo: muto, quelle tre frasi non esistevano.

Le ho scritte io in post, sincronizzate sulla voce vera — trovata
misurando l'onda audio, non a occhio: 6,5s / 8,0s / 10,0s. Bianco con
contorno scuro, in basso, una frase per volta.

- compresso da 47 MB a 2,8 MB, audio a -23,6 dB come tutti
- montato al 36 in coda a il_tradimento: 22 secondi di scena continua,
  provata la catena
- la regola "deve funzionare muto" riscritta in commessa, perche' e'
  quella che si dimentica piu' spesso

Fatti dieci, da fare sette (cinque essenziali).

Co-Authored-By: Claude Opus 5 <noreply@anthropic.com>
</commit_message>
<xml_diff>
--- a/VOLT_Bibbia.docx
+++ b/VOLT_Bibbia.docx
@@ -12575,7 +12575,7 @@
         <w:t>Fatti</w:t>
       </w:r>
       <w:r>
-        <w:t xml:space="preserve"> (già dentro il gioco, nove):</w:t>
+        <w:t xml:space="preserve"> (già dentro il gioco, dieci):</w:t>
       </w:r>
     </w:p>
     <w:tbl>
@@ -13280,6 +13280,89 @@
           </w:p>
         </w:tc>
       </w:tr>
+      <w:tr>
+        <w:tc>
+          <w:tcPr>
+            <w:tcW w:type="dxa" w:w="3173"/>
+            <w:shd w:val="clear" w:fill="F1EFF8"/>
+          </w:tcPr>
+          <w:p>
+            <w:pPr>
+              <w:spacing w:after="40"/>
+            </w:pPr>
+            <w:r>
+              <w:rPr>
+                <w:sz w:val="20"/>
+              </w:rPr>
+            </w:r>
+            <w:r>
+              <w:rPr>
+                <w:rFonts w:ascii="Consolas" w:hAnsi="Consolas"/>
+                <w:color w:val="7A3FD6"/>
+                <w:sz w:val="20"/>
+              </w:rPr>
+              <w:t>il_passaggio</w:t>
+            </w:r>
+          </w:p>
+        </w:tc>
+        <w:tc>
+          <w:tcPr>
+            <w:tcW w:type="dxa" w:w="3173"/>
+            <w:shd w:val="clear" w:fill="F1EFF8"/>
+          </w:tcPr>
+          <w:p>
+            <w:pPr>
+              <w:spacing w:after="40"/>
+            </w:pPr>
+            <w:r>
+              <w:rPr>
+                <w:sz w:val="20"/>
+              </w:rPr>
+            </w:r>
+            <w:r>
+              <w:rPr>
+                <w:sz w:val="20"/>
+              </w:rPr>
+              <w:t>subito dopo, senza stacco</w:t>
+            </w:r>
+          </w:p>
+        </w:tc>
+        <w:tc>
+          <w:tcPr>
+            <w:tcW w:type="dxa" w:w="3173"/>
+            <w:shd w:val="clear" w:fill="F1EFF8"/>
+          </w:tcPr>
+          <w:p>
+            <w:pPr>
+              <w:spacing w:after="40"/>
+            </w:pPr>
+            <w:r>
+              <w:rPr>
+                <w:sz w:val="20"/>
+              </w:rPr>
+            </w:r>
+            <w:r>
+              <w:rPr>
+                <w:sz w:val="20"/>
+              </w:rPr>
+              <w:t xml:space="preserve">Si rialza e apre la fenditura su Eclissia; </w:t>
+            </w:r>
+            <w:r>
+              <w:rPr>
+                <w:b/>
+                <w:sz w:val="20"/>
+              </w:rPr>
+              <w:t>il filo di luce verde gli attraversa il petto e lo sfalda</w:t>
+            </w:r>
+            <w:r>
+              <w:rPr>
+                <w:sz w:val="20"/>
+              </w:rPr>
+              <w:t xml:space="preserve"> — è il prezzo; poi indica la strada lo stesso: «È DI LÀ. PERDONATEMI… ERA L'UNICO MODO PER RESTARE VIVO.»</w:t>
+            </w:r>
+          </w:p>
+        </w:tc>
+      </w:tr>
     </w:tbl>
     <w:p/>
     <w:p>
@@ -13287,10 +13370,10 @@
         <w:rPr>
           <w:b/>
         </w:rPr>
-        <w:t>Da fare: otto</w:t>
-      </w:r>
-      <w:r>
-        <w:t xml:space="preserve">, qui in ordine di settore. I sei segnati </w:t>
+        <w:t>Da fare: sette</w:t>
+      </w:r>
+      <w:r>
+        <w:t xml:space="preserve">, qui in ordine di settore. I cinque segnati </w:t>
       </w:r>
       <w:r>
         <w:rPr>
@@ -13570,7 +13653,7 @@
                 <w:color w:val="7A3FD6"/>
                 <w:sz w:val="20"/>
               </w:rPr>
-              <w:t>il_passaggio</w:t>
+              <w:t>eclissia</w:t>
             </w:r>
           </w:p>
         </w:tc>
@@ -13592,7 +13675,7 @@
               <w:rPr>
                 <w:sz w:val="20"/>
               </w:rPr>
-              <w:t>35</w:t>
+              <w:t>36</w:t>
             </w:r>
           </w:p>
         </w:tc>
@@ -13614,20 +13697,7 @@
               <w:rPr>
                 <w:sz w:val="20"/>
               </w:rPr>
-              <w:t xml:space="preserve">Si rialza, apre la fenditura, </w:t>
-            </w:r>
-            <w:r>
-              <w:rPr>
-                <w:b/>
-                <w:sz w:val="20"/>
-              </w:rPr>
-              <w:t>vede il prezzo</w:t>
-            </w:r>
-            <w:r>
-              <w:rPr>
-                <w:sz w:val="20"/>
-              </w:rPr>
-              <w:t xml:space="preserve"> — la luce verde lo sfalda — e indica lo stesso: «È DI LÀ»</w:t>
+              <w:t>La prima immagine del mondo nuovo, con la Caldera all'orizzonte</w:t>
             </w:r>
           </w:p>
         </w:tc>
@@ -13647,10 +13717,9 @@
             </w:r>
             <w:r>
               <w:rPr>
-                <w:b/>
-                <w:sz w:val="20"/>
-              </w:rPr>
-              <w:t>essenziale</w:t>
+                <w:sz w:val="20"/>
+              </w:rPr>
+              <w:t>desiderabile</w:t>
             </w:r>
           </w:p>
         </w:tc>
@@ -13696,7 +13765,7 @@
                 <w:color w:val="7A3FD6"/>
                 <w:sz w:val="20"/>
               </w:rPr>
-              <w:t>eclissia</w:t>
+              <w:t>il_reattore</w:t>
             </w:r>
           </w:p>
         </w:tc>
@@ -13717,7 +13786,7 @@
               <w:rPr>
                 <w:sz w:val="20"/>
               </w:rPr>
-              <w:t>36</w:t>
+              <w:t>56</w:t>
             </w:r>
           </w:p>
         </w:tc>
@@ -13738,7 +13807,7 @@
               <w:rPr>
                 <w:sz w:val="20"/>
               </w:rPr>
-              <w:t>La prima immagine del mondo nuovo, con la Caldera all'orizzonte</w:t>
+              <w:t>I tre cristalli si spengono, Ampere esce e si riempie di colpo</w:t>
             </w:r>
           </w:p>
         </w:tc>
@@ -13757,9 +13826,10 @@
             </w:r>
             <w:r>
               <w:rPr>
-                <w:sz w:val="20"/>
-              </w:rPr>
-              <w:t>desiderabile</w:t>
+                <w:b/>
+                <w:sz w:val="20"/>
+              </w:rPr>
+              <w:t>essenziale</w:t>
             </w:r>
           </w:p>
         </w:tc>
@@ -13807,7 +13877,7 @@
                 <w:color w:val="7A3FD6"/>
                 <w:sz w:val="20"/>
               </w:rPr>
-              <w:t>il_reattore</w:t>
+              <w:t>la_scelta_di_echo</w:t>
             </w:r>
           </w:p>
         </w:tc>
@@ -13851,7 +13921,7 @@
               <w:rPr>
                 <w:sz w:val="20"/>
               </w:rPr>
-              <w:t>I tre cristalli si spengono, Ampere esce e si riempie di colpo</w:t>
+              <w:t>ECHO-0 allunga la mano verso la lanterna e la ritira</w:t>
             </w:r>
           </w:p>
         </w:tc>
@@ -13920,7 +13990,7 @@
                 <w:color w:val="7A3FD6"/>
                 <w:sz w:val="20"/>
               </w:rPr>
-              <w:t>la_scelta_di_echo</w:t>
+              <w:t>la_cima</w:t>
             </w:r>
           </w:p>
         </w:tc>
@@ -13941,7 +14011,7 @@
               <w:rPr>
                 <w:sz w:val="20"/>
               </w:rPr>
-              <w:t>56</w:t>
+              <w:t>65</w:t>
             </w:r>
           </w:p>
         </w:tc>
@@ -13962,7 +14032,7 @@
               <w:rPr>
                 <w:sz w:val="20"/>
               </w:rPr>
-              <w:t>ECHO-0 allunga la mano verso la lanterna e la ritira</w:t>
+              <w:t>OHM si condensa sopra il cratere; il segno Ω si accende</w:t>
             </w:r>
           </w:p>
         </w:tc>
@@ -14032,7 +14102,7 @@
                 <w:color w:val="7A3FD6"/>
                 <w:sz w:val="20"/>
               </w:rPr>
-              <w:t>la_cima</w:t>
+              <w:t>il_finale</w:t>
             </w:r>
           </w:p>
         </w:tc>
@@ -14076,7 +14146,7 @@
               <w:rPr>
                 <w:sz w:val="20"/>
               </w:rPr>
-              <w:t>OHM si condensa sopra il cratere; il segno Ω si accende</w:t>
+              <w:t>L'eruzione, il cielo che si cuce, la scintilla che entra in Ampere, Eclio</w:t>
             </w:r>
           </w:p>
         </w:tc>
@@ -14145,7 +14215,7 @@
                 <w:color w:val="7A3FD6"/>
                 <w:sz w:val="20"/>
               </w:rPr>
-              <w:t>il_finale</w:t>
+              <w:t>il_bacio</w:t>
             </w:r>
           </w:p>
         </w:tc>
@@ -14187,7 +14257,7 @@
               <w:rPr>
                 <w:sz w:val="20"/>
               </w:rPr>
-              <w:t>L'eruzione, il cielo che si cuce, la scintilla che entra in Ampere, Eclio</w:t>
+              <w:t>Aren si toglie il casco, lo lascia cadere, abbraccia e bacia Lyra</w:t>
             </w:r>
           </w:p>
         </w:tc>
@@ -14214,126 +14284,11 @@
           </w:p>
         </w:tc>
       </w:tr>
-      <w:tr>
-        <w:tc>
-          <w:tcPr>
-            <w:tcW w:type="dxa" w:w="1904"/>
-            <w:shd w:val="clear" w:fill="F1EFF8"/>
-          </w:tcPr>
-          <w:p>
-            <w:pPr>
-              <w:spacing w:after="40"/>
-            </w:pPr>
-            <w:r>
-              <w:rPr>
-                <w:sz w:val="20"/>
-              </w:rPr>
-            </w:r>
-            <w:r>
-              <w:rPr>
-                <w:sz w:val="20"/>
-              </w:rPr>
-              <w:t>8</w:t>
-            </w:r>
-          </w:p>
-        </w:tc>
-        <w:tc>
-          <w:tcPr>
-            <w:tcW w:type="dxa" w:w="1904"/>
-            <w:shd w:val="clear" w:fill="F1EFF8"/>
-          </w:tcPr>
-          <w:p>
-            <w:pPr>
-              <w:spacing w:after="40"/>
-            </w:pPr>
-            <w:r>
-              <w:rPr>
-                <w:sz w:val="20"/>
-              </w:rPr>
-            </w:r>
-            <w:r>
-              <w:rPr>
-                <w:rFonts w:ascii="Consolas" w:hAnsi="Consolas"/>
-                <w:color w:val="7A3FD6"/>
-                <w:sz w:val="20"/>
-              </w:rPr>
-              <w:t>il_bacio</w:t>
-            </w:r>
-          </w:p>
-        </w:tc>
-        <w:tc>
-          <w:tcPr>
-            <w:tcW w:type="dxa" w:w="1904"/>
-            <w:shd w:val="clear" w:fill="F1EFF8"/>
-          </w:tcPr>
-          <w:p>
-            <w:pPr>
-              <w:spacing w:after="40"/>
-            </w:pPr>
-            <w:r>
-              <w:rPr>
-                <w:sz w:val="20"/>
-              </w:rPr>
-            </w:r>
-            <w:r>
-              <w:rPr>
-                <w:sz w:val="20"/>
-              </w:rPr>
-              <w:t>65</w:t>
-            </w:r>
-          </w:p>
-        </w:tc>
-        <w:tc>
-          <w:tcPr>
-            <w:tcW w:type="dxa" w:w="1904"/>
-            <w:shd w:val="clear" w:fill="F1EFF8"/>
-          </w:tcPr>
-          <w:p>
-            <w:pPr>
-              <w:spacing w:after="40"/>
-            </w:pPr>
-            <w:r>
-              <w:rPr>
-                <w:sz w:val="20"/>
-              </w:rPr>
-            </w:r>
-            <w:r>
-              <w:rPr>
-                <w:sz w:val="20"/>
-              </w:rPr>
-              <w:t>Aren si toglie il casco, lo lascia cadere, abbraccia e bacia Lyra</w:t>
-            </w:r>
-          </w:p>
-        </w:tc>
-        <w:tc>
-          <w:tcPr>
-            <w:tcW w:type="dxa" w:w="1904"/>
-            <w:shd w:val="clear" w:fill="F1EFF8"/>
-          </w:tcPr>
-          <w:p>
-            <w:pPr>
-              <w:spacing w:after="40"/>
-            </w:pPr>
-            <w:r>
-              <w:rPr>
-                <w:sz w:val="20"/>
-              </w:rPr>
-            </w:r>
-            <w:r>
-              <w:rPr>
-                <w:b/>
-                <w:sz w:val="20"/>
-              </w:rPr>
-              <w:t>essenziale</w:t>
-            </w:r>
-          </w:p>
-        </w:tc>
-      </w:tr>
     </w:tbl>
     <w:p/>
     <w:p>
       <w:r>
-        <w:t xml:space="preserve">I sei essenziali vanno prodotti </w:t>
+        <w:t xml:space="preserve">I cinque essenziali vanno prodotti </w:t>
       </w:r>
       <w:r>
         <w:rPr>
@@ -14397,16 +14352,7 @@
         <w:t>il_bacio</w:t>
       </w:r>
       <w:r>
-        <w:t xml:space="preserve">, che sono una sequenza sola. </w:t>
-      </w:r>
-      <w:r>
-        <w:rPr>
-          <w:b/>
-        </w:rPr>
-        <w:t>`il_passaggio` è il seguito immediato di `il_tradimento`</w:t>
-      </w:r>
-      <w:r>
-        <w:t>, che è già girato: attacca esattamente dove quello finisce.</w:t>
+        <w:t>, che sono una sequenza sola.</w:t>
       </w:r>
     </w:p>
     <w:p>

</xml_diff>

<commit_message>
v84 — settore 35: la Frattura e' finita. Si gioca dall'1 al 35.
L'ultimo appuntamento con ECHO-0, e l'unico in cui non scappa.

- il piu' duro di tutti: 462 di vita contro i 130 del primo incontro
- combatte su due fronti insieme, ed e' la somma di quello che hai gia'
  visto: ti tiene a distanza come al 24, e ogni 6-10 secondi molla tutto
  e si butta sulla lanterna come nei settori della caccia
- sotto il 14% non fugge: si piega su un fianco, si appoggia a terra e
  resta li'. «NON SI RIALZA», e poi «NON HO PIU' NIENTE DA RUBARVI»
- da li' non si puo' piu' colpire: infierire su uno in ginocchio non e'
  quello che fanno i Custodi, e il gioco non lo permette
- il portale si apre da solo, e all'uscita partono il_tradimento e
  il_passaggio di fila: 22 secondi senza stacco

Provati tutti i 35 settori di fila: nessun errore.

Co-Authored-By: Claude Opus 5 <noreply@anthropic.com>
</commit_message>
<xml_diff>
--- a/VOLT_Bibbia.docx
+++ b/VOLT_Bibbia.docx
@@ -2584,6 +2584,19 @@
           <w:sz w:val="21"/>
         </w:rPr>
         <w:t>(quando lo respingi)</w:t>
+      </w:r>
+      <w:r>
+        <w:rPr>
+          <w:sz w:val="21"/>
+        </w:rPr>
+        <w:t xml:space="preserve"> «NON HO PIÙ NIENTE DA RUBARVI.» </w:t>
+      </w:r>
+      <w:r>
+        <w:rPr>
+          <w:i/>
+          <w:sz w:val="21"/>
+        </w:rPr>
+        <w:t>(quando cade, settore 35)</w:t>
       </w:r>
       <w:r>
         <w:rPr>
@@ -9984,7 +9997,7 @@
         <w:pStyle w:val="Heading1"/>
       </w:pPr>
       <w:r>
-        <w:t>10. Cos'è vero oggi nel gioco (versione 79)</w:t>
+        <w:t>10. Cos'è vero oggi nel gioco (versione 84)</w:t>
       </w:r>
     </w:p>
     <w:p>
@@ -10875,7 +10888,166 @@
         <w:pStyle w:val="ListBullet"/>
       </w:pPr>
       <w:r>
-        <w:t xml:space="preserve">Oltre il 34 il gioco </w:t>
+        <w:rPr>
+          <w:b/>
+        </w:rPr>
+        <w:t>Settore 35: lo scontro vero, e l'unico in cui ECHO-0 non scappa.</w:t>
+      </w:r>
+      <w:r>
+        <w:t xml:space="preserve"> - È il quarto e ultimo appuntamento, ed è </w:t>
+      </w:r>
+      <w:r>
+        <w:rPr>
+          <w:b/>
+        </w:rPr>
+        <w:t>il più duro di tutti</w:t>
+      </w:r>
+      <w:r>
+        <w:t>: quasi il</w:t>
+      </w:r>
+      <w:r>
+        <w:t xml:space="preserve"> quadruplo della vita del primo incontro.</w:t>
+      </w:r>
+      <w:r>
+        <w:t xml:space="preserve"> - </w:t>
+      </w:r>
+      <w:r>
+        <w:rPr>
+          <w:b/>
+        </w:rPr>
+        <w:t>Combatte su due fronti insieme</w:t>
+      </w:r>
+      <w:r>
+        <w:t>, ed è la somma dei tre scontri che hai</w:t>
+      </w:r>
+      <w:r>
+        <w:t xml:space="preserve"> già fatto: ti tiene a distanza e ti martella come al 24, e ogni sei-dieci</w:t>
+      </w:r>
+      <w:r>
+        <w:t xml:space="preserve"> secondi </w:t>
+      </w:r>
+      <w:r>
+        <w:rPr>
+          <w:b/>
+        </w:rPr>
+        <w:t>molla tutto e si butta sulla lanterna</w:t>
+      </w:r>
+      <w:r>
+        <w:t xml:space="preserve"> come nei settori della</w:t>
+      </w:r>
+      <w:r>
+        <w:t xml:space="preserve"> caccia. Chi ha giocato dal 21 riconosce tutte e due le cose.</w:t>
+      </w:r>
+      <w:r>
+        <w:t xml:space="preserve"> - </w:t>
+      </w:r>
+      <w:r>
+        <w:rPr>
+          <w:b/>
+        </w:rPr>
+        <w:t>Non fugge: cade.</w:t>
+      </w:r>
+      <w:r>
+        <w:t xml:space="preserve"> Sotto il 14% della vita si piega su un fianco, si</w:t>
+      </w:r>
+      <w:r>
+        <w:t xml:space="preserve"> appoggia a terra e resta lì — banner </w:t>
+      </w:r>
+      <w:r>
+        <w:rPr>
+          <w:b/>
+        </w:rPr>
+        <w:t>«NON SI RIALZA»</w:t>
+      </w:r>
+      <w:r>
+        <w:t>, e un attimo dopo</w:t>
+      </w:r>
+      <w:r>
+        <w:t xml:space="preserve"> la sua ultima battuta: </w:t>
+      </w:r>
+      <w:r>
+        <w:rPr>
+          <w:b/>
+        </w:rPr>
+        <w:t>«NON HO PIÙ NIENTE DA RUBARVI»</w:t>
+      </w:r>
+      <w:r>
+        <w:t>.</w:t>
+      </w:r>
+      <w:r>
+        <w:t xml:space="preserve"> - </w:t>
+      </w:r>
+      <w:r>
+        <w:rPr>
+          <w:b/>
+        </w:rPr>
+        <w:t>Da lì non si può più colpire.</w:t>
+      </w:r>
+      <w:r>
+        <w:t xml:space="preserve"> Infierire su uno in ginocchio non è quello</w:t>
+      </w:r>
+      <w:r>
+        <w:t xml:space="preserve"> che fanno i Custodi, e il gioco non lo permette. Il portale si apre da solo.</w:t>
+      </w:r>
+      <w:r>
+        <w:t xml:space="preserve"> - </w:t>
+      </w:r>
+      <w:r>
+        <w:rPr>
+          <w:b/>
+        </w:rPr>
+        <w:t>Quello che succede dopo lo racconta il filmato, non il gioco.</w:t>
+      </w:r>
+      <w:r>
+        <w:t xml:space="preserve"> Si entra</w:t>
+      </w:r>
+      <w:r>
+        <w:t xml:space="preserve"> nel portale e partono </w:t>
+      </w:r>
+      <w:r>
+        <w:rPr>
+          <w:rFonts w:ascii="Consolas" w:hAnsi="Consolas"/>
+          <w:color w:val="7A3FD6"/>
+          <w:sz w:val="19"/>
+        </w:rPr>
+        <w:t>il_tradimento</w:t>
+      </w:r>
+      <w:r>
+        <w:t xml:space="preserve"> e </w:t>
+      </w:r>
+      <w:r>
+        <w:rPr>
+          <w:rFonts w:ascii="Consolas" w:hAnsi="Consolas"/>
+          <w:color w:val="7A3FD6"/>
+          <w:sz w:val="19"/>
+        </w:rPr>
+        <w:t>il_passaggio</w:t>
+      </w:r>
+      <w:r>
+        <w:t xml:space="preserve"> di fila, senza</w:t>
+      </w:r>
+      <w:r>
+        <w:t xml:space="preserve"> stacco: la mano di ECHO-1 che strappa Ampere </w:t>
+      </w:r>
+      <w:r>
+        <w:rPr>
+          <w:b/>
+        </w:rPr>
+        <w:t>ai Custodi</w:t>
+      </w:r>
+      <w:r>
+        <w:t>, il prezzo, e la</w:t>
+      </w:r>
+      <w:r>
+        <w:t xml:space="preserve"> strada aperta verso Eclissia.</w:t>
+      </w:r>
+    </w:p>
+    <w:p>
+      <w:pPr>
+        <w:pStyle w:val="ListBullet"/>
+      </w:pPr>
+      <w:r>
+        <w:t xml:space="preserve">Oltre il 35 il gioco </w:t>
       </w:r>
       <w:r>
         <w:rPr>
@@ -10887,7 +11059,10 @@
         <w:t>, invece di far finta: schermata</w:t>
       </w:r>
       <w:r>
-        <w:t xml:space="preserve"> «fine di questo tratto». Il confine si sposta man mano che costruiamo.</w:t>
+        <w:t xml:space="preserve"> «fine di questo tratto», dopo aver fatto vedere i due filmati. Il confine si</w:t>
+      </w:r>
+      <w:r>
+        <w:t xml:space="preserve"> sposta man mano che costruiamo.</w:t>
       </w:r>
     </w:p>
     <w:p>
@@ -10904,10 +11079,10 @@
         <w:rPr>
           <w:b/>
         </w:rPr>
-        <w:t>35-65</w:t>
-      </w:r>
-      <w:r>
-        <w:t>: lo scontro del 35 e il tradimento di ECHO-1, Eclissia, la barra della corrente addosso, i Silenti, il reattore, la salita in 2,5D, la cima in soggettiva, OHM, Ampere rovesciata e i filmati che restano.</w:t>
+        <w:t>36-65</w:t>
+      </w:r>
+      <w:r>
+        <w:t>: il tradimento di ECHO-1, Eclissia, la barra della corrente addosso, i Silenti, il reattore, la salita in 2,5D, la cima in soggettiva, OHM, Ampere rovesciata e i filmati che restano.</w:t>
       </w:r>
     </w:p>
     <w:p>

</xml_diff>

<commit_message>
commessa video: il_reattore e' fatto, toglierlo dai «da fare»
Il filmato e' nel gioco dalla v99 (parte all'uscita dal settore 56), ma
DA-FARE.md, COME-FARE-I-VIDEO.txt e la Bibbia lo davano ancora da
girare: l'altra IA lavora da quei file e rischiava di rifarlo.

Fatti undici, da fare sei (quattro essenziali). la_scelta_di_echo resta
il seguito immediato: attacca dal fotogramma della lanterna accesa a
mezz'aria con cui finisce il_reattore.

Co-Authored-By: Claude Opus 5 <noreply@anthropic.com>
</commit_message>
<xml_diff>
--- a/VOLT_Bibbia.docx
+++ b/VOLT_Bibbia.docx
@@ -13286,7 +13286,7 @@
         <w:t>Fatti</w:t>
       </w:r>
       <w:r>
-        <w:t xml:space="preserve"> (già dentro il gioco, dieci):</w:t>
+        <w:t xml:space="preserve"> (già dentro il gioco, undici):</w:t>
       </w:r>
     </w:p>
     <w:tbl>
@@ -14074,6 +14074,73 @@
           </w:p>
         </w:tc>
       </w:tr>
+      <w:tr>
+        <w:tc>
+          <w:tcPr>
+            <w:tcW w:type="dxa" w:w="3173"/>
+          </w:tcPr>
+          <w:p>
+            <w:pPr>
+              <w:spacing w:after="40"/>
+            </w:pPr>
+            <w:r>
+              <w:rPr>
+                <w:sz w:val="20"/>
+              </w:rPr>
+            </w:r>
+            <w:r>
+              <w:rPr>
+                <w:rFonts w:ascii="Consolas" w:hAnsi="Consolas"/>
+                <w:color w:val="7A3FD6"/>
+                <w:sz w:val="20"/>
+              </w:rPr>
+              <w:t>il_reattore</w:t>
+            </w:r>
+          </w:p>
+        </w:tc>
+        <w:tc>
+          <w:tcPr>
+            <w:tcW w:type="dxa" w:w="3173"/>
+          </w:tcPr>
+          <w:p>
+            <w:pPr>
+              <w:spacing w:after="40"/>
+            </w:pPr>
+            <w:r>
+              <w:rPr>
+                <w:sz w:val="20"/>
+              </w:rPr>
+            </w:r>
+            <w:r>
+              <w:rPr>
+                <w:sz w:val="20"/>
+              </w:rPr>
+              <w:t>fine del settore 56</w:t>
+            </w:r>
+          </w:p>
+        </w:tc>
+        <w:tc>
+          <w:tcPr>
+            <w:tcW w:type="dxa" w:w="3173"/>
+          </w:tcPr>
+          <w:p>
+            <w:pPr>
+              <w:spacing w:after="40"/>
+            </w:pPr>
+            <w:r>
+              <w:rPr>
+                <w:sz w:val="20"/>
+              </w:rPr>
+            </w:r>
+            <w:r>
+              <w:rPr>
+                <w:sz w:val="20"/>
+              </w:rPr>
+              <w:t>I tre cristalli gialli si spengono uno alla volta e i Silenti cadono con loro; Ampere esce dal petto del colosso e si riempie di colpo; i quattro Silenti si rialzano e si voltano verso i Custodi</w:t>
+            </w:r>
+          </w:p>
+        </w:tc>
+      </w:tr>
     </w:tbl>
     <w:p/>
     <w:p>
@@ -14081,10 +14148,10 @@
         <w:rPr>
           <w:b/>
         </w:rPr>
-        <w:t>Da fare: sette</w:t>
-      </w:r>
-      <w:r>
-        <w:t xml:space="preserve">, qui in ordine di settore. I cinque segnati </w:t>
+        <w:t>Da fare: sei</w:t>
+      </w:r>
+      <w:r>
+        <w:t xml:space="preserve">, qui in ordine di settore. I quattro segnati </w:t>
       </w:r>
       <w:r>
         <w:rPr>
@@ -14476,7 +14543,7 @@
                 <w:color w:val="7A3FD6"/>
                 <w:sz w:val="20"/>
               </w:rPr>
-              <w:t>il_reattore</w:t>
+              <w:t>la_scelta_di_echo</w:t>
             </w:r>
           </w:p>
         </w:tc>
@@ -14518,7 +14585,7 @@
               <w:rPr>
                 <w:sz w:val="20"/>
               </w:rPr>
-              <w:t>I tre cristalli si spengono, Ampere esce e si riempie di colpo</w:t>
+              <w:t>ECHO-0 allunga la mano verso la lanterna e la ritira</w:t>
             </w:r>
           </w:p>
         </w:tc>
@@ -14588,7 +14655,7 @@
                 <w:color w:val="7A3FD6"/>
                 <w:sz w:val="20"/>
               </w:rPr>
-              <w:t>la_scelta_di_echo</w:t>
+              <w:t>la_cima</w:t>
             </w:r>
           </w:p>
         </w:tc>
@@ -14610,7 +14677,7 @@
               <w:rPr>
                 <w:sz w:val="20"/>
               </w:rPr>
-              <w:t>56</w:t>
+              <w:t>65</w:t>
             </w:r>
           </w:p>
         </w:tc>
@@ -14632,7 +14699,7 @@
               <w:rPr>
                 <w:sz w:val="20"/>
               </w:rPr>
-              <w:t>ECHO-0 allunga la mano verso la lanterna e la ritira</w:t>
+              <w:t>OHM si condensa sopra il cratere; il segno Ω si accende</w:t>
             </w:r>
           </w:p>
         </w:tc>
@@ -14701,7 +14768,7 @@
                 <w:color w:val="7A3FD6"/>
                 <w:sz w:val="20"/>
               </w:rPr>
-              <w:t>la_cima</w:t>
+              <w:t>il_finale</w:t>
             </w:r>
           </w:p>
         </w:tc>
@@ -14743,7 +14810,7 @@
               <w:rPr>
                 <w:sz w:val="20"/>
               </w:rPr>
-              <w:t>OHM si condensa sopra il cratere; il segno Ω si accende</w:t>
+              <w:t>L'eruzione, il cielo che si cuce, la scintilla che entra in Ampere, Eclio</w:t>
             </w:r>
           </w:p>
         </w:tc>
@@ -14813,7 +14880,7 @@
                 <w:color w:val="7A3FD6"/>
                 <w:sz w:val="20"/>
               </w:rPr>
-              <w:t>il_finale</w:t>
+              <w:t>il_bacio</w:t>
             </w:r>
           </w:p>
         </w:tc>
@@ -14857,7 +14924,7 @@
               <w:rPr>
                 <w:sz w:val="20"/>
               </w:rPr>
-              <w:t>L'eruzione, il cielo che si cuce, la scintilla che entra in Ampere, Eclio</w:t>
+              <w:t>Aren si toglie il casco, lo lascia cadere, abbraccia e bacia Lyra</w:t>
             </w:r>
           </w:p>
         </w:tc>
@@ -14885,130 +14952,17 @@
           </w:p>
         </w:tc>
       </w:tr>
-      <w:tr>
-        <w:tc>
-          <w:tcPr>
-            <w:tcW w:type="dxa" w:w="1904"/>
-          </w:tcPr>
-          <w:p>
-            <w:pPr>
-              <w:spacing w:after="40"/>
-            </w:pPr>
-            <w:r>
-              <w:rPr>
-                <w:sz w:val="20"/>
-              </w:rPr>
-            </w:r>
-            <w:r>
-              <w:rPr>
-                <w:sz w:val="20"/>
-              </w:rPr>
-              <w:t>7</w:t>
-            </w:r>
-          </w:p>
-        </w:tc>
-        <w:tc>
-          <w:tcPr>
-            <w:tcW w:type="dxa" w:w="1904"/>
-          </w:tcPr>
-          <w:p>
-            <w:pPr>
-              <w:spacing w:after="40"/>
-            </w:pPr>
-            <w:r>
-              <w:rPr>
-                <w:sz w:val="20"/>
-              </w:rPr>
-            </w:r>
-            <w:r>
-              <w:rPr>
-                <w:rFonts w:ascii="Consolas" w:hAnsi="Consolas"/>
-                <w:color w:val="7A3FD6"/>
-                <w:sz w:val="20"/>
-              </w:rPr>
-              <w:t>il_bacio</w:t>
-            </w:r>
-          </w:p>
-        </w:tc>
-        <w:tc>
-          <w:tcPr>
-            <w:tcW w:type="dxa" w:w="1904"/>
-          </w:tcPr>
-          <w:p>
-            <w:pPr>
-              <w:spacing w:after="40"/>
-            </w:pPr>
-            <w:r>
-              <w:rPr>
-                <w:sz w:val="20"/>
-              </w:rPr>
-            </w:r>
-            <w:r>
-              <w:rPr>
-                <w:sz w:val="20"/>
-              </w:rPr>
-              <w:t>65</w:t>
-            </w:r>
-          </w:p>
-        </w:tc>
-        <w:tc>
-          <w:tcPr>
-            <w:tcW w:type="dxa" w:w="1904"/>
-          </w:tcPr>
-          <w:p>
-            <w:pPr>
-              <w:spacing w:after="40"/>
-            </w:pPr>
-            <w:r>
-              <w:rPr>
-                <w:sz w:val="20"/>
-              </w:rPr>
-            </w:r>
-            <w:r>
-              <w:rPr>
-                <w:sz w:val="20"/>
-              </w:rPr>
-              <w:t>Aren si toglie il casco, lo lascia cadere, abbraccia e bacia Lyra</w:t>
-            </w:r>
-          </w:p>
-        </w:tc>
-        <w:tc>
-          <w:tcPr>
-            <w:tcW w:type="dxa" w:w="1904"/>
-          </w:tcPr>
-          <w:p>
-            <w:pPr>
-              <w:spacing w:after="40"/>
-            </w:pPr>
-            <w:r>
-              <w:rPr>
-                <w:sz w:val="20"/>
-              </w:rPr>
-            </w:r>
-            <w:r>
-              <w:rPr>
-                <w:b/>
-                <w:sz w:val="20"/>
-              </w:rPr>
-              <w:t>essenziale</w:t>
-            </w:r>
-          </w:p>
-        </w:tc>
-      </w:tr>
     </w:tbl>
     <w:p/>
     <w:p>
       <w:r>
-        <w:t xml:space="preserve">I cinque essenziali vanno prodotti </w:t>
-      </w:r>
-      <w:r>
-        <w:rPr>
-          <w:b/>
-        </w:rPr>
-        <w:t>a coppie</w:t>
-      </w:r>
-      <w:r>
-        <w:t xml:space="preserve">, perché sono scene divise in due: </w:t>
+        <w:rPr>
+          <w:b/>
+        </w:rPr>
+        <w:t>`la_scelta_di_echo` attacca dove finisce `il_reattore`</w:t>
+      </w:r>
+      <w:r>
+        <w:t xml:space="preserve">, che è già girato: la lanterna accesa a mezz'aria è l'ultimo fotogramma dell'uno e il primo dell'altro. </w:t>
       </w:r>
       <w:r>
         <w:rPr>
@@ -15016,7 +14970,7 @@
           <w:color w:val="7A3FD6"/>
           <w:sz w:val="19"/>
         </w:rPr>
-        <w:t>il_reattore</w:t>
+        <w:t>la_cima</w:t>
       </w:r>
       <w:r>
         <w:t>+</w:t>
@@ -15027,10 +14981,10 @@
           <w:color w:val="7A3FD6"/>
           <w:sz w:val="19"/>
         </w:rPr>
-        <w:t>la_scelta_di_echo</w:t>
-      </w:r>
-      <w:r>
-        <w:t xml:space="preserve">, e </w:t>
+        <w:t>il_finale</w:t>
+      </w:r>
+      <w:r>
+        <w:t>+</w:t>
       </w:r>
       <w:r>
         <w:rPr>
@@ -15038,32 +14992,10 @@
           <w:color w:val="7A3FD6"/>
           <w:sz w:val="19"/>
         </w:rPr>
-        <w:t>la_cima</w:t>
-      </w:r>
-      <w:r>
-        <w:t>+</w:t>
-      </w:r>
-      <w:r>
-        <w:rPr>
-          <w:rFonts w:ascii="Consolas" w:hAnsi="Consolas"/>
-          <w:color w:val="7A3FD6"/>
-          <w:sz w:val="19"/>
-        </w:rPr>
-        <w:t>il_finale</w:t>
-      </w:r>
-      <w:r>
-        <w:t>+</w:t>
-      </w:r>
-      <w:r>
-        <w:rPr>
-          <w:rFonts w:ascii="Consolas" w:hAnsi="Consolas"/>
-          <w:color w:val="7A3FD6"/>
-          <w:sz w:val="19"/>
-        </w:rPr>
         <w:t>il_bacio</w:t>
       </w:r>
       <w:r>
-        <w:t>, che sono una sequenza sola.</w:t>
+        <w:t xml:space="preserve"> sono una sequenza sola, e vanno prodotti insieme.</w:t>
       </w:r>
     </w:p>
     <w:p>

</xml_diff>